<commit_message>
docs: added web and browser overview
</commit_message>
<xml_diff>
--- a/flutter_documents/f4_networking_and_database/f10_flutter_databases_self-study.docx
+++ b/flutter_documents/f4_networking_and_database/f10_flutter_databases_self-study.docx
@@ -365,6 +365,7 @@
         <w:t xml:space="preserve">await </w:t>
       </w:r>
       <w:proofErr w:type="spellStart"/>
+      <w:proofErr w:type="gramStart"/>
       <w:r>
         <w:rPr>
           <w:rFonts w:cs="Calibri"/>
@@ -377,6 +378,7 @@
         <w:t>prefs.setBool</w:t>
       </w:r>
       <w:proofErr w:type="spellEnd"/>
+      <w:proofErr w:type="gramEnd"/>
       <w:r>
         <w:rPr>
           <w:rFonts w:cs="Calibri"/>
@@ -461,6 +463,7 @@
         <w:t xml:space="preserve"> = </w:t>
       </w:r>
       <w:proofErr w:type="spellStart"/>
+      <w:proofErr w:type="gramStart"/>
       <w:r>
         <w:rPr>
           <w:rFonts w:cs="Calibri"/>
@@ -473,6 +476,7 @@
         <w:t>prefs.getBool</w:t>
       </w:r>
       <w:proofErr w:type="spellEnd"/>
+      <w:proofErr w:type="gramEnd"/>
       <w:r>
         <w:rPr>
           <w:rFonts w:cs="Calibri"/>
@@ -524,7 +528,33 @@
           <w:sz w:val="32"/>
           <w:szCs w:val="32"/>
         </w:rPr>
-        <w:t xml:space="preserve"># Use </w:t>
+        <w:t># Use</w:t>
+      </w:r>
+      <w:r>
+        <w:rPr>
+          <w:rFonts w:cs="Calibri"/>
+          <w:sz w:val="32"/>
+          <w:szCs w:val="32"/>
+        </w:rPr>
+        <w:t xml:space="preserve"> </w:t>
+      </w:r>
+      <w:r>
+        <w:rPr>
+          <w:rFonts w:cs="Calibri"/>
+          <w:b/>
+          <w:bCs/>
+          <w:sz w:val="32"/>
+          <w:szCs w:val="32"/>
+        </w:rPr>
+        <w:t>Flutter</w:t>
+      </w:r>
+      <w:r>
+        <w:rPr>
+          <w:rFonts w:cs="Calibri"/>
+          <w:sz w:val="32"/>
+          <w:szCs w:val="32"/>
+        </w:rPr>
+        <w:t xml:space="preserve"> </w:t>
       </w:r>
       <w:r>
         <w:rPr>
@@ -615,6 +645,7 @@
         <w:t xml:space="preserve">await </w:t>
       </w:r>
       <w:proofErr w:type="spellStart"/>
+      <w:proofErr w:type="gramStart"/>
       <w:r>
         <w:rPr>
           <w:rFonts w:cs="Calibri"/>
@@ -627,6 +658,7 @@
         <w:t>storage.write</w:t>
       </w:r>
       <w:proofErr w:type="spellEnd"/>
+      <w:proofErr w:type="gramEnd"/>
       <w:r>
         <w:rPr>
           <w:rFonts w:cs="Calibri"/>
@@ -845,6 +877,7 @@
         <w:t xml:space="preserve">await </w:t>
       </w:r>
       <w:proofErr w:type="spellStart"/>
+      <w:proofErr w:type="gramStart"/>
       <w:r>
         <w:rPr>
           <w:rFonts w:cs="Calibri"/>
@@ -866,7 +899,19 @@
           <w:sz w:val="32"/>
           <w:szCs w:val="32"/>
         </w:rPr>
-        <w:t xml:space="preserve">(‘user’, </w:t>
+        <w:t>(</w:t>
+      </w:r>
+      <w:proofErr w:type="gramEnd"/>
+      <w:r>
+        <w:rPr>
+          <w:rFonts w:cs="Calibri"/>
+          <w:b/>
+          <w:bCs/>
+          <w:color w:val="D86DCB" w:themeColor="accent5" w:themeTint="99"/>
+          <w:sz w:val="32"/>
+          <w:szCs w:val="32"/>
+        </w:rPr>
+        <w:t xml:space="preserve">‘user’, </w:t>
       </w:r>
       <w:proofErr w:type="spellStart"/>
       <w:r>
@@ -1090,6 +1135,7 @@
         <w:t xml:space="preserve"> = await </w:t>
       </w:r>
       <w:proofErr w:type="spellStart"/>
+      <w:proofErr w:type="gramStart"/>
       <w:r>
         <w:rPr>
           <w:rFonts w:cs="Calibri"/>
@@ -1111,7 +1157,19 @@
           <w:sz w:val="32"/>
           <w:szCs w:val="32"/>
         </w:rPr>
-        <w:t>();</w:t>
+        <w:t>(</w:t>
+      </w:r>
+      <w:proofErr w:type="gramEnd"/>
+      <w:r>
+        <w:rPr>
+          <w:rFonts w:cs="Calibri"/>
+          <w:b/>
+          <w:bCs/>
+          <w:color w:val="D86DCB" w:themeColor="accent5" w:themeTint="99"/>
+          <w:sz w:val="32"/>
+          <w:szCs w:val="32"/>
+        </w:rPr>
+        <w:t>);</w:t>
       </w:r>
     </w:p>
     <w:p>
@@ -1138,6 +1196,7 @@
         <w:t>final file = File(‘$(</w:t>
       </w:r>
       <w:proofErr w:type="spellStart"/>
+      <w:proofErr w:type="gramStart"/>
       <w:r>
         <w:rPr>
           <w:rFonts w:cs="Calibri"/>
@@ -1150,6 +1209,7 @@
         <w:t>dir.path</w:t>
       </w:r>
       <w:proofErr w:type="spellEnd"/>
+      <w:proofErr w:type="gramEnd"/>
       <w:r>
         <w:rPr>
           <w:rFonts w:cs="Calibri"/>
@@ -1186,6 +1246,7 @@
         <w:t xml:space="preserve">await </w:t>
       </w:r>
       <w:proofErr w:type="spellStart"/>
+      <w:proofErr w:type="gramStart"/>
       <w:r>
         <w:rPr>
           <w:rFonts w:cs="Calibri"/>
@@ -1198,6 +1259,7 @@
         <w:t>file.writeAsBytes</w:t>
       </w:r>
       <w:proofErr w:type="spellEnd"/>
+      <w:proofErr w:type="gramEnd"/>
       <w:r>
         <w:rPr>
           <w:rFonts w:cs="Calibri"/>
@@ -1916,6 +1978,7 @@
         <w:t xml:space="preserve"> </w:t>
       </w:r>
       <w:proofErr w:type="spellStart"/>
+      <w:proofErr w:type="gramStart"/>
       <w:r>
         <w:rPr>
           <w:rFonts w:cs="Calibri"/>
@@ -1927,6 +1990,7 @@
         <w:t>main.dart</w:t>
       </w:r>
       <w:proofErr w:type="spellEnd"/>
+      <w:proofErr w:type="gramEnd"/>
       <w:r>
         <w:rPr>
           <w:rFonts w:cs="Calibri"/>
@@ -1989,6 +2053,7 @@
         </w:rPr>
         <w:t xml:space="preserve"> is asynchronous so we have to convert the </w:t>
       </w:r>
+      <w:proofErr w:type="gramStart"/>
       <w:r>
         <w:rPr>
           <w:rFonts w:cs="Calibri"/>
@@ -2007,7 +2072,18 @@
           <w:sz w:val="32"/>
           <w:szCs w:val="32"/>
         </w:rPr>
-        <w:t>()</w:t>
+        <w:t>(</w:t>
+      </w:r>
+      <w:proofErr w:type="gramEnd"/>
+      <w:r>
+        <w:rPr>
+          <w:rFonts w:cs="Calibri"/>
+          <w:b/>
+          <w:bCs/>
+          <w:sz w:val="32"/>
+          <w:szCs w:val="32"/>
+        </w:rPr>
+        <w:t>)</w:t>
       </w:r>
       <w:r>
         <w:rPr>
@@ -2091,7 +2167,31 @@
           <w:sz w:val="32"/>
           <w:szCs w:val="32"/>
         </w:rPr>
-        <w:t>void main() async {</w:t>
+        <w:t xml:space="preserve">void </w:t>
+      </w:r>
+      <w:proofErr w:type="gramStart"/>
+      <w:r>
+        <w:rPr>
+          <w:rFonts w:cs="Calibri"/>
+          <w:b/>
+          <w:bCs/>
+          <w:color w:val="D86DCB" w:themeColor="accent5" w:themeTint="99"/>
+          <w:sz w:val="32"/>
+          <w:szCs w:val="32"/>
+        </w:rPr>
+        <w:t>main(</w:t>
+      </w:r>
+      <w:proofErr w:type="gramEnd"/>
+      <w:r>
+        <w:rPr>
+          <w:rFonts w:cs="Calibri"/>
+          <w:b/>
+          <w:bCs/>
+          <w:color w:val="D86DCB" w:themeColor="accent5" w:themeTint="99"/>
+          <w:sz w:val="32"/>
+          <w:szCs w:val="32"/>
+        </w:rPr>
+        <w:t>) async {</w:t>
       </w:r>
     </w:p>
     <w:p>
@@ -2238,6 +2338,7 @@
         <w:t xml:space="preserve">  </w:t>
       </w:r>
       <w:proofErr w:type="spellStart"/>
+      <w:proofErr w:type="gramStart"/>
       <w:r>
         <w:rPr>
           <w:rFonts w:cs="Calibri"/>
@@ -2259,7 +2360,19 @@
           <w:sz w:val="32"/>
           <w:szCs w:val="32"/>
         </w:rPr>
-        <w:t xml:space="preserve">(const </w:t>
+        <w:t>(</w:t>
+      </w:r>
+      <w:proofErr w:type="gramEnd"/>
+      <w:r>
+        <w:rPr>
+          <w:rFonts w:cs="Calibri"/>
+          <w:b/>
+          <w:bCs/>
+          <w:color w:val="D86DCB" w:themeColor="accent5" w:themeTint="99"/>
+          <w:sz w:val="32"/>
+          <w:szCs w:val="32"/>
+        </w:rPr>
+        <w:t xml:space="preserve">const </w:t>
       </w:r>
       <w:proofErr w:type="spellStart"/>
       <w:r>
@@ -2374,6 +2487,7 @@
         <w:t xml:space="preserve"> Only recommended to use if we want to manually set Hive directory. Here, </w:t>
       </w:r>
       <w:proofErr w:type="spellStart"/>
+      <w:proofErr w:type="gramStart"/>
       <w:r>
         <w:rPr>
           <w:rFonts w:cs="Calibri"/>
@@ -2393,7 +2507,18 @@
           <w:sz w:val="32"/>
           <w:szCs w:val="32"/>
         </w:rPr>
-        <w:t>()</w:t>
+        <w:t>(</w:t>
+      </w:r>
+      <w:proofErr w:type="gramEnd"/>
+      <w:r>
+        <w:rPr>
+          <w:rFonts w:cs="Calibri"/>
+          <w:b/>
+          <w:bCs/>
+          <w:sz w:val="32"/>
+          <w:szCs w:val="32"/>
+        </w:rPr>
+        <w:t>)</w:t>
       </w:r>
       <w:r>
         <w:rPr>
@@ -2425,7 +2550,31 @@
           <w:sz w:val="32"/>
           <w:szCs w:val="32"/>
         </w:rPr>
-        <w:t>void main() async {</w:t>
+        <w:t xml:space="preserve">void </w:t>
+      </w:r>
+      <w:proofErr w:type="gramStart"/>
+      <w:r>
+        <w:rPr>
+          <w:rFonts w:cs="Calibri"/>
+          <w:b/>
+          <w:bCs/>
+          <w:color w:val="D86DCB" w:themeColor="accent5" w:themeTint="99"/>
+          <w:sz w:val="32"/>
+          <w:szCs w:val="32"/>
+        </w:rPr>
+        <w:t>main(</w:t>
+      </w:r>
+      <w:proofErr w:type="gramEnd"/>
+      <w:r>
+        <w:rPr>
+          <w:rFonts w:cs="Calibri"/>
+          <w:b/>
+          <w:bCs/>
+          <w:color w:val="D86DCB" w:themeColor="accent5" w:themeTint="99"/>
+          <w:sz w:val="32"/>
+          <w:szCs w:val="32"/>
+        </w:rPr>
+        <w:t>) async {</w:t>
       </w:r>
     </w:p>
     <w:p>
@@ -2524,6 +2673,7 @@
         <w:t xml:space="preserve"> = await </w:t>
       </w:r>
       <w:proofErr w:type="spellStart"/>
+      <w:proofErr w:type="gramStart"/>
       <w:r>
         <w:rPr>
           <w:rFonts w:cs="Calibri"/>
@@ -2545,7 +2695,19 @@
           <w:sz w:val="32"/>
           <w:szCs w:val="32"/>
         </w:rPr>
-        <w:t>();</w:t>
+        <w:t>(</w:t>
+      </w:r>
+      <w:proofErr w:type="gramEnd"/>
+      <w:r>
+        <w:rPr>
+          <w:rFonts w:cs="Calibri"/>
+          <w:b/>
+          <w:bCs/>
+          <w:color w:val="D86DCB" w:themeColor="accent5" w:themeTint="99"/>
+          <w:sz w:val="32"/>
+          <w:szCs w:val="32"/>
+        </w:rPr>
+        <w:t>);</w:t>
       </w:r>
     </w:p>
     <w:p>
@@ -2596,6 +2758,7 @@
         <w:t xml:space="preserve"> = </w:t>
       </w:r>
       <w:proofErr w:type="spellStart"/>
+      <w:proofErr w:type="gramStart"/>
       <w:r>
         <w:rPr>
           <w:rFonts w:cs="Calibri"/>
@@ -2608,6 +2771,7 @@
         <w:t>dir.path</w:t>
       </w:r>
       <w:proofErr w:type="spellEnd"/>
+      <w:proofErr w:type="gramEnd"/>
       <w:r>
         <w:rPr>
           <w:rFonts w:cs="Calibri"/>
@@ -2867,6 +3031,7 @@
         <w:t>import '</w:t>
       </w:r>
       <w:proofErr w:type="spellStart"/>
+      <w:proofErr w:type="gramStart"/>
       <w:r>
         <w:rPr>
           <w:rFonts w:cs="Calibri"/>
@@ -2903,6 +3068,7 @@
         <w:t>hive.dart</w:t>
       </w:r>
       <w:proofErr w:type="spellEnd"/>
+      <w:proofErr w:type="gramEnd"/>
       <w:r>
         <w:rPr>
           <w:rFonts w:cs="Calibri"/>
@@ -2939,6 +3105,7 @@
         <w:t>import '</w:t>
       </w:r>
       <w:proofErr w:type="spellStart"/>
+      <w:proofErr w:type="gramStart"/>
       <w:r>
         <w:rPr>
           <w:rFonts w:cs="Calibri"/>
@@ -2975,6 +3142,7 @@
         <w:t>path_provider.dart</w:t>
       </w:r>
       <w:proofErr w:type="spellEnd"/>
+      <w:proofErr w:type="gramEnd"/>
       <w:r>
         <w:rPr>
           <w:rFonts w:cs="Calibri"/>
@@ -3086,6 +3254,7 @@
         <w:t xml:space="preserve"> = await </w:t>
       </w:r>
       <w:proofErr w:type="spellStart"/>
+      <w:proofErr w:type="gramStart"/>
       <w:r>
         <w:rPr>
           <w:rFonts w:cs="Calibri"/>
@@ -3107,7 +3276,19 @@
           <w:sz w:val="32"/>
           <w:szCs w:val="32"/>
         </w:rPr>
-        <w:t xml:space="preserve">(); </w:t>
+        <w:t>(</w:t>
+      </w:r>
+      <w:proofErr w:type="gramEnd"/>
+      <w:r>
+        <w:rPr>
+          <w:rFonts w:cs="Calibri"/>
+          <w:b/>
+          <w:bCs/>
+          <w:color w:val="D86DCB" w:themeColor="accent5" w:themeTint="99"/>
+          <w:sz w:val="32"/>
+          <w:szCs w:val="32"/>
+        </w:rPr>
+        <w:t xml:space="preserve">); </w:t>
       </w:r>
     </w:p>
     <w:p>
@@ -3197,6 +3378,7 @@
         <w:t>(</w:t>
       </w:r>
       <w:proofErr w:type="spellStart"/>
+      <w:proofErr w:type="gramStart"/>
       <w:r>
         <w:rPr>
           <w:rFonts w:cs="Calibri"/>
@@ -3218,7 +3400,19 @@
           <w:sz w:val="32"/>
           <w:szCs w:val="32"/>
         </w:rPr>
-        <w:t>!.path);</w:t>
+        <w:t>!.</w:t>
+      </w:r>
+      <w:proofErr w:type="gramEnd"/>
+      <w:r>
+        <w:rPr>
+          <w:rFonts w:cs="Calibri"/>
+          <w:b/>
+          <w:bCs/>
+          <w:color w:val="D86DCB" w:themeColor="accent5" w:themeTint="99"/>
+          <w:sz w:val="32"/>
+          <w:szCs w:val="32"/>
+        </w:rPr>
+        <w:t>path);</w:t>
       </w:r>
     </w:p>
     <w:p>
@@ -3403,6 +3597,7 @@
         <w:t>Internal Storage/Android/data/&lt;</w:t>
       </w:r>
       <w:proofErr w:type="spellStart"/>
+      <w:proofErr w:type="gramStart"/>
       <w:r>
         <w:rPr>
           <w:rFonts w:cs="Calibri"/>
@@ -3415,6 +3610,7 @@
         <w:t>your.package</w:t>
       </w:r>
       <w:proofErr w:type="spellEnd"/>
+      <w:proofErr w:type="gramEnd"/>
       <w:r>
         <w:rPr>
           <w:rFonts w:cs="Calibri"/>
@@ -3623,6 +3819,7 @@
         <w:t xml:space="preserve">await </w:t>
       </w:r>
       <w:proofErr w:type="spellStart"/>
+      <w:proofErr w:type="gramStart"/>
       <w:r>
         <w:rPr>
           <w:rFonts w:cs="Calibri"/>
@@ -3635,6 +3832,7 @@
         <w:t>box.close</w:t>
       </w:r>
       <w:proofErr w:type="spellEnd"/>
+      <w:proofErr w:type="gramEnd"/>
       <w:r>
         <w:rPr>
           <w:rFonts w:cs="Calibri"/>
@@ -3695,6 +3893,7 @@
           <w:szCs w:val="32"/>
         </w:rPr>
       </w:pPr>
+      <w:proofErr w:type="gramStart"/>
       <w:r>
         <w:rPr>
           <w:rFonts w:cs="Calibri"/>
@@ -3711,7 +3910,18 @@
           <w:sz w:val="32"/>
           <w:szCs w:val="32"/>
         </w:rPr>
-        <w:t>.put()</w:t>
+        <w:t>.put</w:t>
+      </w:r>
+      <w:proofErr w:type="gramEnd"/>
+      <w:r>
+        <w:rPr>
+          <w:rFonts w:cs="Calibri"/>
+          <w:b/>
+          <w:bCs/>
+          <w:sz w:val="32"/>
+          <w:szCs w:val="32"/>
+        </w:rPr>
+        <w:t>()</w:t>
       </w:r>
       <w:r>
         <w:rPr>
@@ -3743,6 +3953,7 @@
         </w:rPr>
       </w:pPr>
       <w:proofErr w:type="spellStart"/>
+      <w:proofErr w:type="gramStart"/>
       <w:r>
         <w:rPr>
           <w:rFonts w:cs="Calibri"/>
@@ -3766,6 +3977,7 @@
         </w:rPr>
         <w:t>(</w:t>
       </w:r>
+      <w:proofErr w:type="gramEnd"/>
       <w:r>
         <w:rPr>
           <w:rFonts w:cs="Calibri"/>
@@ -3824,6 +4036,7 @@
         </w:rPr>
       </w:pPr>
       <w:proofErr w:type="spellStart"/>
+      <w:proofErr w:type="gramStart"/>
       <w:r>
         <w:rPr>
           <w:rFonts w:cs="Calibri"/>
@@ -3845,22 +4058,35 @@
           <w:sz w:val="32"/>
           <w:szCs w:val="32"/>
         </w:rPr>
-        <w:t>('friends', ['Buzzy', 'Stinger', 'Honey']);</w:t>
-      </w:r>
-    </w:p>
-    <w:p>
-      <w:pPr>
-        <w:jc w:val="both"/>
-        <w:rPr>
-          <w:rFonts w:cs="Calibri"/>
-          <w:b/>
-          <w:bCs/>
-          <w:color w:val="D86DCB" w:themeColor="accent5" w:themeTint="99"/>
-          <w:sz w:val="32"/>
-          <w:szCs w:val="32"/>
-        </w:rPr>
-      </w:pPr>
-      <w:proofErr w:type="spellStart"/>
+        <w:t>(</w:t>
+      </w:r>
+      <w:proofErr w:type="gramEnd"/>
+      <w:r>
+        <w:rPr>
+          <w:rFonts w:cs="Calibri"/>
+          <w:b/>
+          <w:bCs/>
+          <w:color w:val="D86DCB" w:themeColor="accent5" w:themeTint="99"/>
+          <w:sz w:val="32"/>
+          <w:szCs w:val="32"/>
+        </w:rPr>
+        <w:t>'friends', ['Buzzy', 'Stinger', 'Honey']);</w:t>
+      </w:r>
+    </w:p>
+    <w:p>
+      <w:pPr>
+        <w:jc w:val="both"/>
+        <w:rPr>
+          <w:rFonts w:cs="Calibri"/>
+          <w:b/>
+          <w:bCs/>
+          <w:color w:val="D86DCB" w:themeColor="accent5" w:themeTint="99"/>
+          <w:sz w:val="32"/>
+          <w:szCs w:val="32"/>
+        </w:rPr>
+      </w:pPr>
+      <w:proofErr w:type="spellStart"/>
+      <w:proofErr w:type="gramStart"/>
       <w:r>
         <w:rPr>
           <w:rFonts w:cs="Calibri"/>
@@ -3882,7 +4108,19 @@
           <w:sz w:val="32"/>
           <w:szCs w:val="32"/>
         </w:rPr>
-        <w:t>('memories', {'</w:t>
+        <w:t>(</w:t>
+      </w:r>
+      <w:proofErr w:type="gramEnd"/>
+      <w:r>
+        <w:rPr>
+          <w:rFonts w:cs="Calibri"/>
+          <w:b/>
+          <w:bCs/>
+          <w:color w:val="D86DCB" w:themeColor="accent5" w:themeTint="99"/>
+          <w:sz w:val="32"/>
+          <w:szCs w:val="32"/>
+        </w:rPr>
+        <w:t>'memories', {'</w:t>
       </w:r>
       <w:proofErr w:type="spellStart"/>
       <w:r>
@@ -4101,6 +4339,7 @@
           <w:szCs w:val="32"/>
         </w:rPr>
       </w:pPr>
+      <w:proofErr w:type="gramStart"/>
       <w:r>
         <w:rPr>
           <w:rFonts w:cs="Calibri"/>
@@ -4117,7 +4356,18 @@
           <w:sz w:val="32"/>
           <w:szCs w:val="32"/>
         </w:rPr>
-        <w:t xml:space="preserve">.get() </w:t>
+        <w:t>.get</w:t>
+      </w:r>
+      <w:proofErr w:type="gramEnd"/>
+      <w:r>
+        <w:rPr>
+          <w:rFonts w:cs="Calibri"/>
+          <w:b/>
+          <w:bCs/>
+          <w:sz w:val="32"/>
+          <w:szCs w:val="32"/>
+        </w:rPr>
+        <w:t xml:space="preserve">() </w:t>
       </w:r>
       <w:r>
         <w:rPr>
@@ -4243,6 +4493,7 @@
         <w:t xml:space="preserve">final moves = </w:t>
       </w:r>
       <w:proofErr w:type="spellStart"/>
+      <w:proofErr w:type="gramStart"/>
       <w:r>
         <w:rPr>
           <w:rFonts w:cs="Calibri"/>
@@ -4264,7 +4515,19 @@
           <w:sz w:val="32"/>
           <w:szCs w:val="32"/>
         </w:rPr>
-        <w:t>('</w:t>
+        <w:t>(</w:t>
+      </w:r>
+      <w:proofErr w:type="gramEnd"/>
+      <w:r>
+        <w:rPr>
+          <w:rFonts w:cs="Calibri"/>
+          <w:b/>
+          <w:bCs/>
+          <w:color w:val="D86DCB" w:themeColor="accent5" w:themeTint="99"/>
+          <w:sz w:val="32"/>
+          <w:szCs w:val="32"/>
+        </w:rPr>
+        <w:t>'</w:t>
       </w:r>
       <w:proofErr w:type="spellStart"/>
       <w:r>
@@ -4390,17 +4653,37 @@
           <w:sz w:val="32"/>
           <w:szCs w:val="32"/>
         </w:rPr>
-        <w:t xml:space="preserve"># To remove a single entry from our box, use </w:t>
-      </w:r>
-      <w:r>
-        <w:rPr>
-          <w:rFonts w:cs="Calibri"/>
-          <w:b/>
-          <w:bCs/>
-          <w:sz w:val="32"/>
-          <w:szCs w:val="32"/>
-        </w:rPr>
-        <w:t xml:space="preserve">.delete() </w:t>
+        <w:t xml:space="preserve"># To remove a single entry from our box, </w:t>
+      </w:r>
+      <w:proofErr w:type="gramStart"/>
+      <w:r>
+        <w:rPr>
+          <w:rFonts w:cs="Calibri"/>
+          <w:sz w:val="32"/>
+          <w:szCs w:val="32"/>
+        </w:rPr>
+        <w:t xml:space="preserve">use </w:t>
+      </w:r>
+      <w:r>
+        <w:rPr>
+          <w:rFonts w:cs="Calibri"/>
+          <w:b/>
+          <w:bCs/>
+          <w:sz w:val="32"/>
+          <w:szCs w:val="32"/>
+        </w:rPr>
+        <w:t>.delete</w:t>
+      </w:r>
+      <w:proofErr w:type="gramEnd"/>
+      <w:r>
+        <w:rPr>
+          <w:rFonts w:cs="Calibri"/>
+          <w:b/>
+          <w:bCs/>
+          <w:sz w:val="32"/>
+          <w:szCs w:val="32"/>
+        </w:rPr>
+        <w:t xml:space="preserve">() </w:t>
       </w:r>
       <w:r>
         <w:rPr>
@@ -4440,17 +4723,37 @@
           <w:sz w:val="32"/>
           <w:szCs w:val="32"/>
         </w:rPr>
-        <w:t xml:space="preserve">box, using </w:t>
-      </w:r>
-      <w:r>
-        <w:rPr>
-          <w:rFonts w:cs="Calibri"/>
-          <w:b/>
-          <w:bCs/>
-          <w:sz w:val="32"/>
-          <w:szCs w:val="32"/>
-        </w:rPr>
-        <w:t>.clear()</w:t>
+        <w:t xml:space="preserve">box, </w:t>
+      </w:r>
+      <w:proofErr w:type="gramStart"/>
+      <w:r>
+        <w:rPr>
+          <w:rFonts w:cs="Calibri"/>
+          <w:sz w:val="32"/>
+          <w:szCs w:val="32"/>
+        </w:rPr>
+        <w:t xml:space="preserve">using </w:t>
+      </w:r>
+      <w:r>
+        <w:rPr>
+          <w:rFonts w:cs="Calibri"/>
+          <w:b/>
+          <w:bCs/>
+          <w:sz w:val="32"/>
+          <w:szCs w:val="32"/>
+        </w:rPr>
+        <w:t>.clear</w:t>
+      </w:r>
+      <w:proofErr w:type="gramEnd"/>
+      <w:r>
+        <w:rPr>
+          <w:rFonts w:cs="Calibri"/>
+          <w:b/>
+          <w:bCs/>
+          <w:sz w:val="32"/>
+          <w:szCs w:val="32"/>
+        </w:rPr>
+        <w:t>()</w:t>
       </w:r>
       <w:r>
         <w:rPr>
@@ -4474,6 +4777,7 @@
         </w:rPr>
       </w:pPr>
       <w:proofErr w:type="spellStart"/>
+      <w:proofErr w:type="gramStart"/>
       <w:r>
         <w:rPr>
           <w:rFonts w:cs="Calibri"/>
@@ -4486,6 +4790,7 @@
         <w:t>box.clear</w:t>
       </w:r>
       <w:proofErr w:type="spellEnd"/>
+      <w:proofErr w:type="gramEnd"/>
       <w:r>
         <w:rPr>
           <w:rFonts w:cs="Calibri"/>
@@ -4595,6 +4900,7 @@
         <w:t xml:space="preserve">final box = </w:t>
       </w:r>
       <w:proofErr w:type="spellStart"/>
+      <w:proofErr w:type="gramStart"/>
       <w:r>
         <w:rPr>
           <w:rFonts w:cs="Calibri"/>
@@ -4616,7 +4922,19 @@
           <w:sz w:val="32"/>
           <w:szCs w:val="32"/>
         </w:rPr>
-        <w:t>();</w:t>
+        <w:t>(</w:t>
+      </w:r>
+      <w:proofErr w:type="gramEnd"/>
+      <w:r>
+        <w:rPr>
+          <w:rFonts w:cs="Calibri"/>
+          <w:b/>
+          <w:bCs/>
+          <w:color w:val="D86DCB" w:themeColor="accent5" w:themeTint="99"/>
+          <w:sz w:val="32"/>
+          <w:szCs w:val="32"/>
+        </w:rPr>
+        <w:t>);</w:t>
       </w:r>
     </w:p>
     <w:p>
@@ -4717,6 +5035,7 @@
         <w:t>print(</w:t>
       </w:r>
       <w:proofErr w:type="spellStart"/>
+      <w:proofErr w:type="gramStart"/>
       <w:r>
         <w:rPr>
           <w:rFonts w:cs="Calibri"/>
@@ -4729,6 +5048,7 @@
         <w:t>box.getAt</w:t>
       </w:r>
       <w:proofErr w:type="spellEnd"/>
+      <w:proofErr w:type="gramEnd"/>
       <w:r>
         <w:rPr>
           <w:rFonts w:cs="Calibri"/>
@@ -4765,6 +5085,7 @@
         <w:t>print(</w:t>
       </w:r>
       <w:proofErr w:type="spellStart"/>
+      <w:proofErr w:type="gramStart"/>
       <w:r>
         <w:rPr>
           <w:rFonts w:cs="Calibri"/>
@@ -4777,6 +5098,7 @@
         <w:t>box.getAt</w:t>
       </w:r>
       <w:proofErr w:type="spellEnd"/>
+      <w:proofErr w:type="gramEnd"/>
       <w:r>
         <w:rPr>
           <w:rFonts w:cs="Calibri"/>
@@ -4839,6 +5161,7 @@
         <w:t xml:space="preserve">final box = </w:t>
       </w:r>
       <w:proofErr w:type="spellStart"/>
+      <w:proofErr w:type="gramStart"/>
       <w:r>
         <w:rPr>
           <w:rFonts w:cs="Calibri"/>
@@ -4860,7 +5183,19 @@
           <w:sz w:val="32"/>
           <w:szCs w:val="32"/>
         </w:rPr>
-        <w:t>();</w:t>
+        <w:t>(</w:t>
+      </w:r>
+      <w:proofErr w:type="gramEnd"/>
+      <w:r>
+        <w:rPr>
+          <w:rFonts w:cs="Calibri"/>
+          <w:b/>
+          <w:bCs/>
+          <w:color w:val="D86DCB" w:themeColor="accent5" w:themeTint="99"/>
+          <w:sz w:val="32"/>
+          <w:szCs w:val="32"/>
+        </w:rPr>
+        <w:t>);</w:t>
       </w:r>
     </w:p>
     <w:p>
@@ -4924,6 +5259,7 @@
         <w:t>print(</w:t>
       </w:r>
       <w:proofErr w:type="spellStart"/>
+      <w:proofErr w:type="gramStart"/>
       <w:r>
         <w:rPr>
           <w:rFonts w:cs="Calibri"/>
@@ -4936,6 +5272,7 @@
         <w:t>box.getAt</w:t>
       </w:r>
       <w:proofErr w:type="spellEnd"/>
+      <w:proofErr w:type="gramEnd"/>
       <w:r>
         <w:rPr>
           <w:rFonts w:cs="Calibri"/>
@@ -5040,6 +5377,7 @@
         </w:rPr>
       </w:pPr>
       <w:proofErr w:type="spellStart"/>
+      <w:proofErr w:type="gramStart"/>
       <w:r>
         <w:rPr>
           <w:rFonts w:cs="Calibri"/>
@@ -5061,7 +5399,19 @@
           <w:sz w:val="32"/>
           <w:szCs w:val="32"/>
         </w:rPr>
-        <w:t>('key', 'Orchid');</w:t>
+        <w:t>(</w:t>
+      </w:r>
+      <w:proofErr w:type="gramEnd"/>
+      <w:r>
+        <w:rPr>
+          <w:rFonts w:cs="Calibri"/>
+          <w:b/>
+          <w:bCs/>
+          <w:color w:val="D86DCB" w:themeColor="accent5" w:themeTint="99"/>
+          <w:sz w:val="32"/>
+          <w:szCs w:val="32"/>
+        </w:rPr>
+        <w:t>'key', 'Orchid');</w:t>
       </w:r>
     </w:p>
     <w:p>
@@ -5086,6 +5436,7 @@
         <w:t>print(</w:t>
       </w:r>
       <w:proofErr w:type="spellStart"/>
+      <w:proofErr w:type="gramStart"/>
       <w:r>
         <w:rPr>
           <w:rFonts w:cs="Calibri"/>
@@ -5098,6 +5449,7 @@
         <w:t>box.getAt</w:t>
       </w:r>
       <w:proofErr w:type="spellEnd"/>
+      <w:proofErr w:type="gramEnd"/>
       <w:r>
         <w:rPr>
           <w:rFonts w:cs="Calibri"/>
@@ -5155,6 +5507,7 @@
         <w:t>print(</w:t>
       </w:r>
       <w:proofErr w:type="spellStart"/>
+      <w:proofErr w:type="gramStart"/>
       <w:r>
         <w:rPr>
           <w:rFonts w:cs="Calibri"/>
@@ -5167,6 +5520,7 @@
         <w:t>box.getAt</w:t>
       </w:r>
       <w:proofErr w:type="spellEnd"/>
+      <w:proofErr w:type="gramEnd"/>
       <w:r>
         <w:rPr>
           <w:rFonts w:cs="Calibri"/>
@@ -5292,7 +5646,31 @@
           <w:sz w:val="32"/>
           <w:szCs w:val="32"/>
         </w:rPr>
-        <w:t xml:space="preserve">print(box[0]); </w:t>
+        <w:t>print(</w:t>
+      </w:r>
+      <w:proofErr w:type="gramStart"/>
+      <w:r>
+        <w:rPr>
+          <w:rFonts w:cs="Calibri"/>
+          <w:b/>
+          <w:bCs/>
+          <w:color w:val="D86DCB" w:themeColor="accent5" w:themeTint="99"/>
+          <w:sz w:val="32"/>
+          <w:szCs w:val="32"/>
+        </w:rPr>
+        <w:t>box[</w:t>
+      </w:r>
+      <w:proofErr w:type="gramEnd"/>
+      <w:r>
+        <w:rPr>
+          <w:rFonts w:cs="Calibri"/>
+          <w:b/>
+          <w:bCs/>
+          <w:color w:val="D86DCB" w:themeColor="accent5" w:themeTint="99"/>
+          <w:sz w:val="32"/>
+          <w:szCs w:val="32"/>
+        </w:rPr>
+        <w:t xml:space="preserve">0]); </w:t>
       </w:r>
       <w:r>
         <w:rPr>
@@ -5331,16 +5709,29 @@
           <w:szCs w:val="32"/>
         </w:rPr>
       </w:pPr>
-      <w:r>
-        <w:rPr>
-          <w:rFonts w:cs="Calibri"/>
-          <w:b/>
-          <w:bCs/>
-          <w:color w:val="D86DCB" w:themeColor="accent5" w:themeTint="99"/>
-          <w:sz w:val="32"/>
-          <w:szCs w:val="32"/>
-        </w:rPr>
-        <w:t>box[0] = 'Daffodil';</w:t>
+      <w:proofErr w:type="gramStart"/>
+      <w:r>
+        <w:rPr>
+          <w:rFonts w:cs="Calibri"/>
+          <w:b/>
+          <w:bCs/>
+          <w:color w:val="D86DCB" w:themeColor="accent5" w:themeTint="99"/>
+          <w:sz w:val="32"/>
+          <w:szCs w:val="32"/>
+        </w:rPr>
+        <w:t>box[</w:t>
+      </w:r>
+      <w:proofErr w:type="gramEnd"/>
+      <w:r>
+        <w:rPr>
+          <w:rFonts w:cs="Calibri"/>
+          <w:b/>
+          <w:bCs/>
+          <w:color w:val="D86DCB" w:themeColor="accent5" w:themeTint="99"/>
+          <w:sz w:val="32"/>
+          <w:szCs w:val="32"/>
+        </w:rPr>
+        <w:t>0] = 'Daffodil';</w:t>
       </w:r>
     </w:p>
     <w:p>
@@ -5500,15 +5891,27 @@
         <w:t>data_type</w:t>
       </w:r>
       <w:proofErr w:type="spellEnd"/>
-      <w:r>
-        <w:rPr>
-          <w:rFonts w:cs="Calibri"/>
-          <w:b/>
-          <w:bCs/>
-          <w:sz w:val="32"/>
-          <w:szCs w:val="32"/>
-        </w:rPr>
-        <w:t>&gt;()</w:t>
+      <w:proofErr w:type="gramStart"/>
+      <w:r>
+        <w:rPr>
+          <w:rFonts w:cs="Calibri"/>
+          <w:b/>
+          <w:bCs/>
+          <w:sz w:val="32"/>
+          <w:szCs w:val="32"/>
+        </w:rPr>
+        <w:t>&gt;(</w:t>
+      </w:r>
+      <w:proofErr w:type="gramEnd"/>
+      <w:r>
+        <w:rPr>
+          <w:rFonts w:cs="Calibri"/>
+          <w:b/>
+          <w:bCs/>
+          <w:sz w:val="32"/>
+          <w:szCs w:val="32"/>
+        </w:rPr>
+        <w:t>)</w:t>
       </w:r>
       <w:r>
         <w:rPr>
@@ -5564,7 +5967,31 @@
           <w:sz w:val="32"/>
           <w:szCs w:val="32"/>
         </w:rPr>
-        <w:t>&lt;String&gt;(name: '</w:t>
+        <w:t>&lt;String</w:t>
+      </w:r>
+      <w:proofErr w:type="gramStart"/>
+      <w:r>
+        <w:rPr>
+          <w:rFonts w:cs="Calibri"/>
+          <w:b/>
+          <w:bCs/>
+          <w:color w:val="D86DCB" w:themeColor="accent5" w:themeTint="99"/>
+          <w:sz w:val="32"/>
+          <w:szCs w:val="32"/>
+        </w:rPr>
+        <w:t>&gt;(</w:t>
+      </w:r>
+      <w:proofErr w:type="gramEnd"/>
+      <w:r>
+        <w:rPr>
+          <w:rFonts w:cs="Calibri"/>
+          <w:b/>
+          <w:bCs/>
+          <w:color w:val="D86DCB" w:themeColor="accent5" w:themeTint="99"/>
+          <w:sz w:val="32"/>
+          <w:szCs w:val="32"/>
+        </w:rPr>
+        <w:t>name: '</w:t>
       </w:r>
       <w:proofErr w:type="spellStart"/>
       <w:r>
@@ -5604,6 +6031,7 @@
         </w:rPr>
       </w:pPr>
       <w:proofErr w:type="spellStart"/>
+      <w:proofErr w:type="gramStart"/>
       <w:r>
         <w:rPr>
           <w:rFonts w:cs="Calibri"/>
@@ -5625,7 +6053,19 @@
           <w:sz w:val="32"/>
           <w:szCs w:val="32"/>
         </w:rPr>
-        <w:t>('</w:t>
+        <w:t>(</w:t>
+      </w:r>
+      <w:proofErr w:type="gramEnd"/>
+      <w:r>
+        <w:rPr>
+          <w:rFonts w:cs="Calibri"/>
+          <w:b/>
+          <w:bCs/>
+          <w:color w:val="D86DCB" w:themeColor="accent5" w:themeTint="99"/>
+          <w:sz w:val="32"/>
+          <w:szCs w:val="32"/>
+        </w:rPr>
+        <w:t>'</w:t>
       </w:r>
       <w:proofErr w:type="spellStart"/>
       <w:r>
@@ -5689,6 +6129,7 @@
         </w:rPr>
       </w:pPr>
       <w:proofErr w:type="spellStart"/>
+      <w:proofErr w:type="gramStart"/>
       <w:r>
         <w:rPr>
           <w:rFonts w:cs="Calibri"/>
@@ -5710,7 +6151,19 @@
           <w:sz w:val="32"/>
           <w:szCs w:val="32"/>
         </w:rPr>
-        <w:t>('</w:t>
+        <w:t>(</w:t>
+      </w:r>
+      <w:proofErr w:type="gramEnd"/>
+      <w:r>
+        <w:rPr>
+          <w:rFonts w:cs="Calibri"/>
+          <w:b/>
+          <w:bCs/>
+          <w:color w:val="D86DCB" w:themeColor="accent5" w:themeTint="99"/>
+          <w:sz w:val="32"/>
+          <w:szCs w:val="32"/>
+        </w:rPr>
+        <w:t>'</w:t>
       </w:r>
       <w:proofErr w:type="spellStart"/>
       <w:r>
@@ -5771,6 +6224,7 @@
         </w:rPr>
       </w:pPr>
       <w:proofErr w:type="spellStart"/>
+      <w:proofErr w:type="gramStart"/>
       <w:r>
         <w:rPr>
           <w:rFonts w:cs="Calibri"/>
@@ -5792,7 +6246,19 @@
           <w:sz w:val="32"/>
           <w:szCs w:val="32"/>
         </w:rPr>
-        <w:t>('</w:t>
+        <w:t>(</w:t>
+      </w:r>
+      <w:proofErr w:type="gramEnd"/>
+      <w:r>
+        <w:rPr>
+          <w:rFonts w:cs="Calibri"/>
+          <w:b/>
+          <w:bCs/>
+          <w:color w:val="D86DCB" w:themeColor="accent5" w:themeTint="99"/>
+          <w:sz w:val="32"/>
+          <w:szCs w:val="32"/>
+        </w:rPr>
+        <w:t>'</w:t>
       </w:r>
       <w:proofErr w:type="spellStart"/>
       <w:r>
@@ -5876,7 +6342,31 @@
           <w:sz w:val="32"/>
           <w:szCs w:val="32"/>
         </w:rPr>
-        <w:t>&lt;int&gt;(name: '</w:t>
+        <w:t>&lt;int</w:t>
+      </w:r>
+      <w:proofErr w:type="gramStart"/>
+      <w:r>
+        <w:rPr>
+          <w:rFonts w:cs="Calibri"/>
+          <w:b/>
+          <w:bCs/>
+          <w:color w:val="D86DCB" w:themeColor="accent5" w:themeTint="99"/>
+          <w:sz w:val="32"/>
+          <w:szCs w:val="32"/>
+        </w:rPr>
+        <w:t>&gt;(</w:t>
+      </w:r>
+      <w:proofErr w:type="gramEnd"/>
+      <w:r>
+        <w:rPr>
+          <w:rFonts w:cs="Calibri"/>
+          <w:b/>
+          <w:bCs/>
+          <w:color w:val="D86DCB" w:themeColor="accent5" w:themeTint="99"/>
+          <w:sz w:val="32"/>
+          <w:szCs w:val="32"/>
+        </w:rPr>
+        <w:t>name: '</w:t>
       </w:r>
       <w:proofErr w:type="spellStart"/>
       <w:r>
@@ -6090,6 +6580,7 @@
         <w:t xml:space="preserve">final box = </w:t>
       </w:r>
       <w:proofErr w:type="spellStart"/>
+      <w:proofErr w:type="gramStart"/>
       <w:r>
         <w:rPr>
           <w:rFonts w:cs="Calibri"/>
@@ -6111,22 +6602,35 @@
           <w:sz w:val="32"/>
           <w:szCs w:val="32"/>
         </w:rPr>
-        <w:t>();</w:t>
-      </w:r>
-    </w:p>
-    <w:p>
-      <w:pPr>
-        <w:jc w:val="both"/>
-        <w:rPr>
-          <w:rFonts w:cs="Calibri"/>
-          <w:b/>
-          <w:bCs/>
-          <w:color w:val="D86DCB" w:themeColor="accent5" w:themeTint="99"/>
-          <w:sz w:val="32"/>
-          <w:szCs w:val="32"/>
-        </w:rPr>
-      </w:pPr>
-      <w:proofErr w:type="spellStart"/>
+        <w:t>(</w:t>
+      </w:r>
+      <w:proofErr w:type="gramEnd"/>
+      <w:r>
+        <w:rPr>
+          <w:rFonts w:cs="Calibri"/>
+          <w:b/>
+          <w:bCs/>
+          <w:color w:val="D86DCB" w:themeColor="accent5" w:themeTint="99"/>
+          <w:sz w:val="32"/>
+          <w:szCs w:val="32"/>
+        </w:rPr>
+        <w:t>);</w:t>
+      </w:r>
+    </w:p>
+    <w:p>
+      <w:pPr>
+        <w:jc w:val="both"/>
+        <w:rPr>
+          <w:rFonts w:cs="Calibri"/>
+          <w:b/>
+          <w:bCs/>
+          <w:color w:val="D86DCB" w:themeColor="accent5" w:themeTint="99"/>
+          <w:sz w:val="32"/>
+          <w:szCs w:val="32"/>
+        </w:rPr>
+      </w:pPr>
+      <w:proofErr w:type="spellStart"/>
+      <w:proofErr w:type="gramStart"/>
       <w:r>
         <w:rPr>
           <w:rFonts w:cs="Calibri"/>
@@ -6148,6 +6652,217 @@
           <w:sz w:val="32"/>
           <w:szCs w:val="32"/>
         </w:rPr>
+        <w:t>(</w:t>
+      </w:r>
+      <w:proofErr w:type="gramEnd"/>
+      <w:r>
+        <w:rPr>
+          <w:rFonts w:cs="Calibri"/>
+          <w:b/>
+          <w:bCs/>
+          <w:color w:val="D86DCB" w:themeColor="accent5" w:themeTint="99"/>
+          <w:sz w:val="32"/>
+          <w:szCs w:val="32"/>
+        </w:rPr>
+        <w:t>'</w:t>
+      </w:r>
+      <w:proofErr w:type="spellStart"/>
+      <w:r>
+        <w:rPr>
+          <w:rFonts w:cs="Calibri"/>
+          <w:b/>
+          <w:bCs/>
+          <w:color w:val="D86DCB" w:themeColor="accent5" w:themeTint="99"/>
+          <w:sz w:val="32"/>
+          <w:szCs w:val="32"/>
+        </w:rPr>
+        <w:t>nectarType</w:t>
+      </w:r>
+      <w:proofErr w:type="spellEnd"/>
+      <w:r>
+        <w:rPr>
+          <w:rFonts w:cs="Calibri"/>
+          <w:b/>
+          <w:bCs/>
+          <w:color w:val="D86DCB" w:themeColor="accent5" w:themeTint="99"/>
+          <w:sz w:val="32"/>
+          <w:szCs w:val="32"/>
+        </w:rPr>
+        <w:t>', 'wildflower');</w:t>
+      </w:r>
+    </w:p>
+    <w:p>
+      <w:pPr>
+        <w:jc w:val="both"/>
+        <w:rPr>
+          <w:rFonts w:cs="Calibri"/>
+          <w:sz w:val="32"/>
+          <w:szCs w:val="32"/>
+        </w:rPr>
+      </w:pPr>
+      <w:r>
+        <w:rPr>
+          <w:rFonts w:cs="Calibri"/>
+          <w:sz w:val="32"/>
+          <w:szCs w:val="32"/>
+        </w:rPr>
+        <w:t># Isolates the function.</w:t>
+      </w:r>
+    </w:p>
+    <w:p>
+      <w:pPr>
+        <w:jc w:val="both"/>
+        <w:rPr>
+          <w:rFonts w:cs="Calibri"/>
+          <w:b/>
+          <w:bCs/>
+          <w:color w:val="D86DCB" w:themeColor="accent5" w:themeTint="99"/>
+          <w:sz w:val="32"/>
+          <w:szCs w:val="32"/>
+        </w:rPr>
+      </w:pPr>
+      <w:r>
+        <w:rPr>
+          <w:rFonts w:cs="Calibri"/>
+          <w:b/>
+          <w:bCs/>
+          <w:color w:val="D86DCB" w:themeColor="accent5" w:themeTint="99"/>
+          <w:sz w:val="32"/>
+          <w:szCs w:val="32"/>
+        </w:rPr>
+        <w:t xml:space="preserve">await </w:t>
+      </w:r>
+      <w:proofErr w:type="spellStart"/>
+      <w:r>
+        <w:rPr>
+          <w:rFonts w:cs="Calibri"/>
+          <w:b/>
+          <w:bCs/>
+          <w:color w:val="D86DCB" w:themeColor="accent5" w:themeTint="99"/>
+          <w:sz w:val="32"/>
+          <w:szCs w:val="32"/>
+        </w:rPr>
+        <w:t>Hive.compute</w:t>
+      </w:r>
+      <w:proofErr w:type="spellEnd"/>
+      <w:r>
+        <w:rPr>
+          <w:rFonts w:cs="Calibri"/>
+          <w:b/>
+          <w:bCs/>
+          <w:color w:val="D86DCB" w:themeColor="accent5" w:themeTint="99"/>
+          <w:sz w:val="32"/>
+          <w:szCs w:val="32"/>
+        </w:rPr>
+        <w:t>(() {</w:t>
+      </w:r>
+    </w:p>
+    <w:p>
+      <w:pPr>
+        <w:jc w:val="both"/>
+        <w:rPr>
+          <w:rFonts w:cs="Calibri"/>
+          <w:b/>
+          <w:bCs/>
+          <w:color w:val="D86DCB" w:themeColor="accent5" w:themeTint="99"/>
+          <w:sz w:val="32"/>
+          <w:szCs w:val="32"/>
+        </w:rPr>
+      </w:pPr>
+      <w:r>
+        <w:rPr>
+          <w:rFonts w:cs="Calibri"/>
+          <w:b/>
+          <w:bCs/>
+          <w:color w:val="D86DCB" w:themeColor="accent5" w:themeTint="99"/>
+          <w:sz w:val="32"/>
+          <w:szCs w:val="32"/>
+        </w:rPr>
+        <w:t xml:space="preserve">  final box = </w:t>
+      </w:r>
+      <w:proofErr w:type="spellStart"/>
+      <w:proofErr w:type="gramStart"/>
+      <w:r>
+        <w:rPr>
+          <w:rFonts w:cs="Calibri"/>
+          <w:b/>
+          <w:bCs/>
+          <w:color w:val="D86DCB" w:themeColor="accent5" w:themeTint="99"/>
+          <w:sz w:val="32"/>
+          <w:szCs w:val="32"/>
+        </w:rPr>
+        <w:t>Hive.box</w:t>
+      </w:r>
+      <w:proofErr w:type="spellEnd"/>
+      <w:r>
+        <w:rPr>
+          <w:rFonts w:cs="Calibri"/>
+          <w:b/>
+          <w:bCs/>
+          <w:color w:val="D86DCB" w:themeColor="accent5" w:themeTint="99"/>
+          <w:sz w:val="32"/>
+          <w:szCs w:val="32"/>
+        </w:rPr>
+        <w:t>(</w:t>
+      </w:r>
+      <w:proofErr w:type="gramEnd"/>
+      <w:r>
+        <w:rPr>
+          <w:rFonts w:cs="Calibri"/>
+          <w:b/>
+          <w:bCs/>
+          <w:color w:val="D86DCB" w:themeColor="accent5" w:themeTint="99"/>
+          <w:sz w:val="32"/>
+          <w:szCs w:val="32"/>
+        </w:rPr>
+        <w:t>);</w:t>
+      </w:r>
+    </w:p>
+    <w:p>
+      <w:pPr>
+        <w:jc w:val="both"/>
+        <w:rPr>
+          <w:rFonts w:cs="Calibri"/>
+          <w:b/>
+          <w:bCs/>
+          <w:color w:val="D86DCB" w:themeColor="accent5" w:themeTint="99"/>
+          <w:sz w:val="32"/>
+          <w:szCs w:val="32"/>
+        </w:rPr>
+      </w:pPr>
+      <w:r>
+        <w:rPr>
+          <w:rFonts w:cs="Calibri"/>
+          <w:b/>
+          <w:bCs/>
+          <w:color w:val="D86DCB" w:themeColor="accent5" w:themeTint="99"/>
+          <w:sz w:val="32"/>
+          <w:szCs w:val="32"/>
+        </w:rPr>
+        <w:t xml:space="preserve">  print(</w:t>
+      </w:r>
+      <w:proofErr w:type="spellStart"/>
+      <w:r>
+        <w:rPr>
+          <w:rFonts w:cs="Calibri"/>
+          <w:b/>
+          <w:bCs/>
+          <w:color w:val="D86DCB" w:themeColor="accent5" w:themeTint="99"/>
+          <w:sz w:val="32"/>
+          <w:szCs w:val="32"/>
+        </w:rPr>
+        <w:t>box.get</w:t>
+      </w:r>
+      <w:proofErr w:type="spellEnd"/>
+      <w:r>
+        <w:rPr>
+          <w:rFonts w:cs="Calibri"/>
+          <w:b/>
+          <w:bCs/>
+          <w:color w:val="D86DCB" w:themeColor="accent5" w:themeTint="99"/>
+          <w:sz w:val="32"/>
+          <w:szCs w:val="32"/>
+        </w:rPr>
         <w:t>('</w:t>
       </w:r>
       <w:proofErr w:type="spellStart"/>
@@ -6172,192 +6887,6 @@
           <w:sz w:val="32"/>
           <w:szCs w:val="32"/>
         </w:rPr>
-        <w:t>', 'wildflower');</w:t>
-      </w:r>
-    </w:p>
-    <w:p>
-      <w:pPr>
-        <w:jc w:val="both"/>
-        <w:rPr>
-          <w:rFonts w:cs="Calibri"/>
-          <w:sz w:val="32"/>
-          <w:szCs w:val="32"/>
-        </w:rPr>
-      </w:pPr>
-      <w:r>
-        <w:rPr>
-          <w:rFonts w:cs="Calibri"/>
-          <w:sz w:val="32"/>
-          <w:szCs w:val="32"/>
-        </w:rPr>
-        <w:t># Isolates the function.</w:t>
-      </w:r>
-    </w:p>
-    <w:p>
-      <w:pPr>
-        <w:jc w:val="both"/>
-        <w:rPr>
-          <w:rFonts w:cs="Calibri"/>
-          <w:b/>
-          <w:bCs/>
-          <w:color w:val="D86DCB" w:themeColor="accent5" w:themeTint="99"/>
-          <w:sz w:val="32"/>
-          <w:szCs w:val="32"/>
-        </w:rPr>
-      </w:pPr>
-      <w:r>
-        <w:rPr>
-          <w:rFonts w:cs="Calibri"/>
-          <w:b/>
-          <w:bCs/>
-          <w:color w:val="D86DCB" w:themeColor="accent5" w:themeTint="99"/>
-          <w:sz w:val="32"/>
-          <w:szCs w:val="32"/>
-        </w:rPr>
-        <w:t xml:space="preserve">await </w:t>
-      </w:r>
-      <w:proofErr w:type="spellStart"/>
-      <w:r>
-        <w:rPr>
-          <w:rFonts w:cs="Calibri"/>
-          <w:b/>
-          <w:bCs/>
-          <w:color w:val="D86DCB" w:themeColor="accent5" w:themeTint="99"/>
-          <w:sz w:val="32"/>
-          <w:szCs w:val="32"/>
-        </w:rPr>
-        <w:t>Hive.compute</w:t>
-      </w:r>
-      <w:proofErr w:type="spellEnd"/>
-      <w:r>
-        <w:rPr>
-          <w:rFonts w:cs="Calibri"/>
-          <w:b/>
-          <w:bCs/>
-          <w:color w:val="D86DCB" w:themeColor="accent5" w:themeTint="99"/>
-          <w:sz w:val="32"/>
-          <w:szCs w:val="32"/>
-        </w:rPr>
-        <w:t>(() {</w:t>
-      </w:r>
-    </w:p>
-    <w:p>
-      <w:pPr>
-        <w:jc w:val="both"/>
-        <w:rPr>
-          <w:rFonts w:cs="Calibri"/>
-          <w:b/>
-          <w:bCs/>
-          <w:color w:val="D86DCB" w:themeColor="accent5" w:themeTint="99"/>
-          <w:sz w:val="32"/>
-          <w:szCs w:val="32"/>
-        </w:rPr>
-      </w:pPr>
-      <w:r>
-        <w:rPr>
-          <w:rFonts w:cs="Calibri"/>
-          <w:b/>
-          <w:bCs/>
-          <w:color w:val="D86DCB" w:themeColor="accent5" w:themeTint="99"/>
-          <w:sz w:val="32"/>
-          <w:szCs w:val="32"/>
-        </w:rPr>
-        <w:t xml:space="preserve">  final box = </w:t>
-      </w:r>
-      <w:proofErr w:type="spellStart"/>
-      <w:r>
-        <w:rPr>
-          <w:rFonts w:cs="Calibri"/>
-          <w:b/>
-          <w:bCs/>
-          <w:color w:val="D86DCB" w:themeColor="accent5" w:themeTint="99"/>
-          <w:sz w:val="32"/>
-          <w:szCs w:val="32"/>
-        </w:rPr>
-        <w:t>Hive.box</w:t>
-      </w:r>
-      <w:proofErr w:type="spellEnd"/>
-      <w:r>
-        <w:rPr>
-          <w:rFonts w:cs="Calibri"/>
-          <w:b/>
-          <w:bCs/>
-          <w:color w:val="D86DCB" w:themeColor="accent5" w:themeTint="99"/>
-          <w:sz w:val="32"/>
-          <w:szCs w:val="32"/>
-        </w:rPr>
-        <w:t>();</w:t>
-      </w:r>
-    </w:p>
-    <w:p>
-      <w:pPr>
-        <w:jc w:val="both"/>
-        <w:rPr>
-          <w:rFonts w:cs="Calibri"/>
-          <w:b/>
-          <w:bCs/>
-          <w:color w:val="D86DCB" w:themeColor="accent5" w:themeTint="99"/>
-          <w:sz w:val="32"/>
-          <w:szCs w:val="32"/>
-        </w:rPr>
-      </w:pPr>
-      <w:r>
-        <w:rPr>
-          <w:rFonts w:cs="Calibri"/>
-          <w:b/>
-          <w:bCs/>
-          <w:color w:val="D86DCB" w:themeColor="accent5" w:themeTint="99"/>
-          <w:sz w:val="32"/>
-          <w:szCs w:val="32"/>
-        </w:rPr>
-        <w:t xml:space="preserve">  print(</w:t>
-      </w:r>
-      <w:proofErr w:type="spellStart"/>
-      <w:r>
-        <w:rPr>
-          <w:rFonts w:cs="Calibri"/>
-          <w:b/>
-          <w:bCs/>
-          <w:color w:val="D86DCB" w:themeColor="accent5" w:themeTint="99"/>
-          <w:sz w:val="32"/>
-          <w:szCs w:val="32"/>
-        </w:rPr>
-        <w:t>box.get</w:t>
-      </w:r>
-      <w:proofErr w:type="spellEnd"/>
-      <w:r>
-        <w:rPr>
-          <w:rFonts w:cs="Calibri"/>
-          <w:b/>
-          <w:bCs/>
-          <w:color w:val="D86DCB" w:themeColor="accent5" w:themeTint="99"/>
-          <w:sz w:val="32"/>
-          <w:szCs w:val="32"/>
-        </w:rPr>
-        <w:t>('</w:t>
-      </w:r>
-      <w:proofErr w:type="spellStart"/>
-      <w:r>
-        <w:rPr>
-          <w:rFonts w:cs="Calibri"/>
-          <w:b/>
-          <w:bCs/>
-          <w:color w:val="D86DCB" w:themeColor="accent5" w:themeTint="99"/>
-          <w:sz w:val="32"/>
-          <w:szCs w:val="32"/>
-        </w:rPr>
-        <w:t>nectarType</w:t>
-      </w:r>
-      <w:proofErr w:type="spellEnd"/>
-      <w:r>
-        <w:rPr>
-          <w:rFonts w:cs="Calibri"/>
-          <w:b/>
-          <w:bCs/>
-          <w:color w:val="D86DCB" w:themeColor="accent5" w:themeTint="99"/>
-          <w:sz w:val="32"/>
-          <w:szCs w:val="32"/>
-        </w:rPr>
         <w:t>'));</w:t>
       </w:r>
     </w:p>
@@ -6385,6 +6914,7 @@
         <w:t xml:space="preserve">  </w:t>
       </w:r>
       <w:proofErr w:type="spellStart"/>
+      <w:proofErr w:type="gramStart"/>
       <w:r>
         <w:rPr>
           <w:rFonts w:cs="Calibri"/>
@@ -6406,7 +6936,19 @@
           <w:sz w:val="32"/>
           <w:szCs w:val="32"/>
         </w:rPr>
-        <w:t>('</w:t>
+        <w:t>(</w:t>
+      </w:r>
+      <w:proofErr w:type="gramEnd"/>
+      <w:r>
+        <w:rPr>
+          <w:rFonts w:cs="Calibri"/>
+          <w:b/>
+          <w:bCs/>
+          <w:color w:val="D86DCB" w:themeColor="accent5" w:themeTint="99"/>
+          <w:sz w:val="32"/>
+          <w:szCs w:val="32"/>
+        </w:rPr>
+        <w:t>'</w:t>
       </w:r>
       <w:proofErr w:type="spellStart"/>
       <w:r>
@@ -6714,9 +7256,21 @@
           <w:sz w:val="32"/>
           <w:szCs w:val="32"/>
         </w:rPr>
-        <w:t>debounce?.cancel</w:t>
-      </w:r>
-      <w:proofErr w:type="spellEnd"/>
+        <w:t>debounce</w:t>
+      </w:r>
+      <w:proofErr w:type="gramStart"/>
+      <w:r>
+        <w:rPr>
+          <w:rFonts w:cs="Calibri"/>
+          <w:b/>
+          <w:bCs/>
+          <w:sz w:val="32"/>
+          <w:szCs w:val="32"/>
+        </w:rPr>
+        <w:t>?.cancel</w:t>
+      </w:r>
+      <w:proofErr w:type="spellEnd"/>
+      <w:proofErr w:type="gramEnd"/>
       <w:r>
         <w:rPr>
           <w:rFonts w:cs="Calibri"/>
@@ -6803,7 +7357,29 @@
           <w:sz w:val="32"/>
           <w:szCs w:val="32"/>
         </w:rPr>
-        <w:t>_debounce = Timer(const Duration(milliseconds: 500), () { })</w:t>
+        <w:t xml:space="preserve">_debounce = </w:t>
+      </w:r>
+      <w:proofErr w:type="gramStart"/>
+      <w:r>
+        <w:rPr>
+          <w:rFonts w:cs="Calibri"/>
+          <w:b/>
+          <w:bCs/>
+          <w:sz w:val="32"/>
+          <w:szCs w:val="32"/>
+        </w:rPr>
+        <w:t>Timer(</w:t>
+      </w:r>
+      <w:proofErr w:type="gramEnd"/>
+      <w:r>
+        <w:rPr>
+          <w:rFonts w:cs="Calibri"/>
+          <w:b/>
+          <w:bCs/>
+          <w:sz w:val="32"/>
+          <w:szCs w:val="32"/>
+        </w:rPr>
+        <w:t>const Duration(milliseconds: 500), () { })</w:t>
       </w:r>
       <w:r>
         <w:rPr>
@@ -6854,6 +7430,7 @@
         <w:t xml:space="preserve">Only when the user stops toggling for at least 500ms will </w:t>
       </w:r>
       <w:proofErr w:type="spellStart"/>
+      <w:proofErr w:type="gramStart"/>
       <w:r>
         <w:rPr>
           <w:rFonts w:cs="Calibri"/>
@@ -6863,6 +7440,7 @@
         <w:t>db.updateData</w:t>
       </w:r>
       <w:proofErr w:type="spellEnd"/>
+      <w:proofErr w:type="gramEnd"/>
       <w:r>
         <w:rPr>
           <w:rFonts w:cs="Calibri"/>
@@ -6904,6 +7482,7 @@
         <w:t>import '</w:t>
       </w:r>
       <w:proofErr w:type="spellStart"/>
+      <w:proofErr w:type="gramStart"/>
       <w:r>
         <w:rPr>
           <w:rFonts w:cs="Calibri"/>
@@ -6916,6 +7495,7 @@
         <w:t>dart:async</w:t>
       </w:r>
       <w:proofErr w:type="spellEnd"/>
+      <w:proofErr w:type="gramEnd"/>
       <w:r>
         <w:rPr>
           <w:rFonts w:cs="Calibri"/>
@@ -6976,6 +7556,7 @@
         <w:t xml:space="preserve">void </w:t>
       </w:r>
       <w:proofErr w:type="spellStart"/>
+      <w:proofErr w:type="gramStart"/>
       <w:r>
         <w:rPr>
           <w:rFonts w:cs="Calibri"/>
@@ -6997,7 +7578,19 @@
           <w:sz w:val="32"/>
           <w:szCs w:val="32"/>
         </w:rPr>
-        <w:t xml:space="preserve">(bool? value, int index, Box </w:t>
+        <w:t>(</w:t>
+      </w:r>
+      <w:proofErr w:type="gramEnd"/>
+      <w:r>
+        <w:rPr>
+          <w:rFonts w:cs="Calibri"/>
+          <w:b/>
+          <w:bCs/>
+          <w:color w:val="D86DCB" w:themeColor="accent5" w:themeTint="99"/>
+          <w:sz w:val="32"/>
+          <w:szCs w:val="32"/>
+        </w:rPr>
+        <w:t xml:space="preserve">bool? value, int index, Box </w:t>
       </w:r>
       <w:proofErr w:type="spellStart"/>
       <w:r>
@@ -7168,6 +7761,7 @@
         <w:t xml:space="preserve">  </w:t>
       </w:r>
       <w:proofErr w:type="spellStart"/>
+      <w:proofErr w:type="gramStart"/>
       <w:r>
         <w:rPr>
           <w:rFonts w:cs="Calibri"/>
@@ -7189,7 +7783,19 @@
           <w:sz w:val="32"/>
           <w:szCs w:val="32"/>
         </w:rPr>
-        <w:t xml:space="preserve">({}); </w:t>
+        <w:t>(</w:t>
+      </w:r>
+      <w:proofErr w:type="gramEnd"/>
+      <w:r>
+        <w:rPr>
+          <w:rFonts w:cs="Calibri"/>
+          <w:b/>
+          <w:bCs/>
+          <w:color w:val="D86DCB" w:themeColor="accent5" w:themeTint="99"/>
+          <w:sz w:val="32"/>
+          <w:szCs w:val="32"/>
+        </w:rPr>
+        <w:t xml:space="preserve">{}); </w:t>
       </w:r>
     </w:p>
     <w:p>
@@ -7216,16 +7822,29 @@
         <w:t xml:space="preserve">  _</w:t>
       </w:r>
       <w:proofErr w:type="spellStart"/>
-      <w:r>
-        <w:rPr>
-          <w:rFonts w:cs="Calibri"/>
-          <w:b/>
-          <w:bCs/>
-          <w:color w:val="D86DCB" w:themeColor="accent5" w:themeTint="99"/>
-          <w:sz w:val="32"/>
-          <w:szCs w:val="32"/>
-        </w:rPr>
-        <w:t>debounce?.cancel</w:t>
+      <w:proofErr w:type="gramStart"/>
+      <w:r>
+        <w:rPr>
+          <w:rFonts w:cs="Calibri"/>
+          <w:b/>
+          <w:bCs/>
+          <w:color w:val="D86DCB" w:themeColor="accent5" w:themeTint="99"/>
+          <w:sz w:val="32"/>
+          <w:szCs w:val="32"/>
+        </w:rPr>
+        <w:t>debounce?.</w:t>
+      </w:r>
+      <w:proofErr w:type="gramEnd"/>
+      <w:r>
+        <w:rPr>
+          <w:rFonts w:cs="Calibri"/>
+          <w:b/>
+          <w:bCs/>
+          <w:color w:val="D86DCB" w:themeColor="accent5" w:themeTint="99"/>
+          <w:sz w:val="32"/>
+          <w:szCs w:val="32"/>
+        </w:rPr>
+        <w:t>cancel</w:t>
       </w:r>
       <w:proofErr w:type="spellEnd"/>
       <w:r>
@@ -7261,7 +7880,31 @@
           <w:sz w:val="32"/>
           <w:szCs w:val="32"/>
         </w:rPr>
-        <w:t xml:space="preserve">  _debounce = Timer(const Duration(milliseconds: 500), () {</w:t>
+        <w:t xml:space="preserve">  _debounce = </w:t>
+      </w:r>
+      <w:proofErr w:type="gramStart"/>
+      <w:r>
+        <w:rPr>
+          <w:rFonts w:cs="Calibri"/>
+          <w:b/>
+          <w:bCs/>
+          <w:color w:val="D86DCB" w:themeColor="accent5" w:themeTint="99"/>
+          <w:sz w:val="32"/>
+          <w:szCs w:val="32"/>
+        </w:rPr>
+        <w:t>Timer(</w:t>
+      </w:r>
+      <w:proofErr w:type="gramEnd"/>
+      <w:r>
+        <w:rPr>
+          <w:rFonts w:cs="Calibri"/>
+          <w:b/>
+          <w:bCs/>
+          <w:color w:val="D86DCB" w:themeColor="accent5" w:themeTint="99"/>
+          <w:sz w:val="32"/>
+          <w:szCs w:val="32"/>
+        </w:rPr>
+        <w:t>const Duration(milliseconds: 500), () {</w:t>
       </w:r>
     </w:p>
     <w:p>
@@ -7288,6 +7931,7 @@
         <w:t xml:space="preserve">    </w:t>
       </w:r>
       <w:proofErr w:type="spellStart"/>
+      <w:proofErr w:type="gramStart"/>
       <w:r>
         <w:rPr>
           <w:rFonts w:cs="Calibri"/>
@@ -7300,6 +7944,7 @@
         <w:t>db.updateData</w:t>
       </w:r>
       <w:proofErr w:type="spellEnd"/>
+      <w:proofErr w:type="gramEnd"/>
       <w:r>
         <w:rPr>
           <w:rFonts w:cs="Calibri"/>
@@ -8325,7 +8970,31 @@
           <w:sz w:val="32"/>
           <w:szCs w:val="32"/>
         </w:rPr>
-        <w:t xml:space="preserve">flutter pub add </w:t>
+        <w:t xml:space="preserve">flutter pub </w:t>
+      </w:r>
+      <w:proofErr w:type="gramStart"/>
+      <w:r>
+        <w:rPr>
+          <w:rFonts w:cs="Calibri"/>
+          <w:b/>
+          <w:bCs/>
+          <w:color w:val="60CAF3" w:themeColor="accent4" w:themeTint="99"/>
+          <w:sz w:val="32"/>
+          <w:szCs w:val="32"/>
+        </w:rPr>
+        <w:t>add</w:t>
+      </w:r>
+      <w:proofErr w:type="gramEnd"/>
+      <w:r>
+        <w:rPr>
+          <w:rFonts w:cs="Calibri"/>
+          <w:b/>
+          <w:bCs/>
+          <w:color w:val="60CAF3" w:themeColor="accent4" w:themeTint="99"/>
+          <w:sz w:val="32"/>
+          <w:szCs w:val="32"/>
+        </w:rPr>
+        <w:t xml:space="preserve"> </w:t>
       </w:r>
       <w:proofErr w:type="spellStart"/>
       <w:r>
@@ -8554,6 +9223,7 @@
         <w:tab/>
       </w:r>
       <w:proofErr w:type="spellStart"/>
+      <w:proofErr w:type="gramStart"/>
       <w:r>
         <w:rPr>
           <w:rFonts w:cs="Calibri"/>
@@ -8573,7 +9243,18 @@
           <w:sz w:val="32"/>
           <w:szCs w:val="32"/>
         </w:rPr>
-        <w:t>()</w:t>
+        <w:t>(</w:t>
+      </w:r>
+      <w:proofErr w:type="gramEnd"/>
+      <w:r>
+        <w:rPr>
+          <w:rFonts w:cs="Calibri"/>
+          <w:b/>
+          <w:bCs/>
+          <w:sz w:val="32"/>
+          <w:szCs w:val="32"/>
+        </w:rPr>
+        <w:t>)</w:t>
       </w:r>
     </w:p>
     <w:p>
@@ -8635,6 +9316,7 @@
         <w:tab/>
       </w:r>
       <w:proofErr w:type="spellStart"/>
+      <w:proofErr w:type="gramStart"/>
       <w:r>
         <w:rPr>
           <w:rFonts w:cs="Calibri"/>
@@ -8654,7 +9336,18 @@
           <w:sz w:val="32"/>
           <w:szCs w:val="32"/>
         </w:rPr>
-        <w:t>()</w:t>
+        <w:t>(</w:t>
+      </w:r>
+      <w:proofErr w:type="gramEnd"/>
+      <w:r>
+        <w:rPr>
+          <w:rFonts w:cs="Calibri"/>
+          <w:b/>
+          <w:bCs/>
+          <w:sz w:val="32"/>
+          <w:szCs w:val="32"/>
+        </w:rPr>
+        <w:t>)</w:t>
       </w:r>
     </w:p>
     <w:p>
@@ -8718,6 +9411,7 @@
         <w:tab/>
       </w:r>
       <w:proofErr w:type="spellStart"/>
+      <w:proofErr w:type="gramStart"/>
       <w:r>
         <w:rPr>
           <w:rFonts w:cs="Calibri"/>
@@ -8737,7 +9431,18 @@
           <w:sz w:val="32"/>
           <w:szCs w:val="32"/>
         </w:rPr>
-        <w:t>()</w:t>
+        <w:t>(</w:t>
+      </w:r>
+      <w:proofErr w:type="gramEnd"/>
+      <w:r>
+        <w:rPr>
+          <w:rFonts w:cs="Calibri"/>
+          <w:b/>
+          <w:bCs/>
+          <w:sz w:val="32"/>
+          <w:szCs w:val="32"/>
+        </w:rPr>
+        <w:t>)</w:t>
       </w:r>
     </w:p>
     <w:p>
@@ -8801,6 +9506,7 @@
         <w:tab/>
       </w:r>
       <w:proofErr w:type="spellStart"/>
+      <w:proofErr w:type="gramStart"/>
       <w:r>
         <w:rPr>
           <w:rFonts w:cs="Calibri"/>
@@ -8820,7 +9526,18 @@
           <w:sz w:val="32"/>
           <w:szCs w:val="32"/>
         </w:rPr>
-        <w:t>()</w:t>
+        <w:t>(</w:t>
+      </w:r>
+      <w:proofErr w:type="gramEnd"/>
+      <w:r>
+        <w:rPr>
+          <w:rFonts w:cs="Calibri"/>
+          <w:b/>
+          <w:bCs/>
+          <w:sz w:val="32"/>
+          <w:szCs w:val="32"/>
+        </w:rPr>
+        <w:t>)</w:t>
       </w:r>
     </w:p>
     <w:p>
@@ -8874,6 +9591,7 @@
         <w:tab/>
       </w:r>
       <w:proofErr w:type="spellStart"/>
+      <w:proofErr w:type="gramStart"/>
       <w:r>
         <w:rPr>
           <w:rFonts w:cs="Calibri"/>
@@ -8893,7 +9611,18 @@
           <w:sz w:val="32"/>
           <w:szCs w:val="32"/>
         </w:rPr>
-        <w:t>()</w:t>
+        <w:t>(</w:t>
+      </w:r>
+      <w:proofErr w:type="gramEnd"/>
+      <w:r>
+        <w:rPr>
+          <w:rFonts w:cs="Calibri"/>
+          <w:b/>
+          <w:bCs/>
+          <w:sz w:val="32"/>
+          <w:szCs w:val="32"/>
+        </w:rPr>
+        <w:t>)</w:t>
       </w:r>
     </w:p>
     <w:p>
@@ -8931,6 +9660,7 @@
         </w:rPr>
       </w:pPr>
       <w:proofErr w:type="spellStart"/>
+      <w:proofErr w:type="gramStart"/>
       <w:r>
         <w:rPr>
           <w:rFonts w:cs="Calibri"/>
@@ -8950,7 +9680,18 @@
           <w:sz w:val="32"/>
           <w:szCs w:val="32"/>
         </w:rPr>
-        <w:t>()</w:t>
+        <w:t>(</w:t>
+      </w:r>
+      <w:proofErr w:type="gramEnd"/>
+      <w:r>
+        <w:rPr>
+          <w:rFonts w:cs="Calibri"/>
+          <w:b/>
+          <w:bCs/>
+          <w:sz w:val="32"/>
+          <w:szCs w:val="32"/>
+        </w:rPr>
+        <w:t>)</w:t>
       </w:r>
     </w:p>
     <w:p>
@@ -8970,6 +9711,7 @@
         </w:rPr>
       </w:pPr>
       <w:proofErr w:type="spellStart"/>
+      <w:proofErr w:type="gramStart"/>
       <w:r>
         <w:rPr>
           <w:rFonts w:cs="Calibri"/>
@@ -8990,7 +9732,18 @@
           <w:sz w:val="32"/>
           <w:szCs w:val="32"/>
         </w:rPr>
-        <w:t>()</w:t>
+        <w:t>(</w:t>
+      </w:r>
+      <w:proofErr w:type="gramEnd"/>
+      <w:r>
+        <w:rPr>
+          <w:rFonts w:cs="Calibri"/>
+          <w:b/>
+          <w:bCs/>
+          <w:sz w:val="32"/>
+          <w:szCs w:val="32"/>
+        </w:rPr>
+        <w:t>)</w:t>
       </w:r>
     </w:p>
     <w:p>
@@ -9010,6 +9763,7 @@
         </w:rPr>
       </w:pPr>
       <w:proofErr w:type="spellStart"/>
+      <w:proofErr w:type="gramStart"/>
       <w:r>
         <w:rPr>
           <w:rFonts w:cs="Calibri"/>
@@ -9029,7 +9783,18 @@
           <w:sz w:val="32"/>
           <w:szCs w:val="32"/>
         </w:rPr>
-        <w:t>()</w:t>
+        <w:t>(</w:t>
+      </w:r>
+      <w:proofErr w:type="gramEnd"/>
+      <w:r>
+        <w:rPr>
+          <w:rFonts w:cs="Calibri"/>
+          <w:b/>
+          <w:bCs/>
+          <w:sz w:val="32"/>
+          <w:szCs w:val="32"/>
+        </w:rPr>
+        <w:t>)</w:t>
       </w:r>
     </w:p>
     <w:p>
@@ -9049,6 +9814,7 @@
         </w:rPr>
       </w:pPr>
       <w:proofErr w:type="spellStart"/>
+      <w:proofErr w:type="gramStart"/>
       <w:r>
         <w:rPr>
           <w:rFonts w:cs="Calibri"/>
@@ -9068,7 +9834,18 @@
           <w:sz w:val="32"/>
           <w:szCs w:val="32"/>
         </w:rPr>
-        <w:t>()</w:t>
+        <w:t>(</w:t>
+      </w:r>
+      <w:proofErr w:type="gramEnd"/>
+      <w:r>
+        <w:rPr>
+          <w:rFonts w:cs="Calibri"/>
+          <w:b/>
+          <w:bCs/>
+          <w:sz w:val="32"/>
+          <w:szCs w:val="32"/>
+        </w:rPr>
+        <w:t>)</w:t>
       </w:r>
     </w:p>
     <w:p>
@@ -9088,6 +9865,7 @@
         </w:rPr>
       </w:pPr>
       <w:proofErr w:type="spellStart"/>
+      <w:proofErr w:type="gramStart"/>
       <w:r>
         <w:rPr>
           <w:rFonts w:cs="Calibri"/>
@@ -9107,7 +9885,18 @@
           <w:sz w:val="32"/>
           <w:szCs w:val="32"/>
         </w:rPr>
-        <w:t>()</w:t>
+        <w:t>(</w:t>
+      </w:r>
+      <w:proofErr w:type="gramEnd"/>
+      <w:r>
+        <w:rPr>
+          <w:rFonts w:cs="Calibri"/>
+          <w:b/>
+          <w:bCs/>
+          <w:sz w:val="32"/>
+          <w:szCs w:val="32"/>
+        </w:rPr>
+        <w:t>)</w:t>
       </w:r>
     </w:p>
     <w:p>
@@ -9214,6 +10003,7 @@
         <w:t xml:space="preserve">, so we need to create its </w:t>
       </w:r>
       <w:proofErr w:type="spellStart"/>
+      <w:proofErr w:type="gramStart"/>
       <w:r>
         <w:rPr>
           <w:rFonts w:cs="Calibri"/>
@@ -9233,7 +10023,18 @@
           <w:sz w:val="32"/>
           <w:szCs w:val="32"/>
         </w:rPr>
-        <w:t>()</w:t>
+        <w:t>(</w:t>
+      </w:r>
+      <w:proofErr w:type="gramEnd"/>
+      <w:r>
+        <w:rPr>
+          <w:rFonts w:cs="Calibri"/>
+          <w:b/>
+          <w:bCs/>
+          <w:sz w:val="32"/>
+          <w:szCs w:val="32"/>
+        </w:rPr>
+        <w:t>)</w:t>
       </w:r>
       <w:r>
         <w:rPr>
@@ -9403,15 +10204,7 @@
           <w:sz w:val="32"/>
           <w:szCs w:val="32"/>
         </w:rPr>
-        <w:t xml:space="preserve"> can be used too)</w:t>
-      </w:r>
-      <w:r>
-        <w:rPr>
-          <w:rFonts w:cs="Calibri"/>
-          <w:sz w:val="32"/>
-          <w:szCs w:val="32"/>
-        </w:rPr>
-        <w:t xml:space="preserve"> </w:t>
+        <w:t xml:space="preserve"> can be used too) </w:t>
       </w:r>
       <w:r>
         <w:rPr>
@@ -9752,6 +10545,7 @@
         <w:t>(</w:t>
       </w:r>
       <w:proofErr w:type="spellStart"/>
+      <w:proofErr w:type="gramStart"/>
       <w:r>
         <w:rPr>
           <w:rFonts w:cs="Calibri"/>
@@ -9763,6 +10557,7 @@
         <w:t>model.toJson</w:t>
       </w:r>
       <w:proofErr w:type="spellEnd"/>
+      <w:proofErr w:type="gramEnd"/>
       <w:r>
         <w:rPr>
           <w:rFonts w:cs="Calibri"/>
@@ -9838,6 +10633,7 @@
         <w:t xml:space="preserve">. Then, </w:t>
       </w:r>
       <w:proofErr w:type="spellStart"/>
+      <w:proofErr w:type="gramStart"/>
       <w:r>
         <w:rPr>
           <w:rFonts w:cs="Calibri"/>
@@ -9857,7 +10653,18 @@
           <w:sz w:val="32"/>
           <w:szCs w:val="32"/>
         </w:rPr>
-        <w:t>()</w:t>
+        <w:t>(</w:t>
+      </w:r>
+      <w:proofErr w:type="gramEnd"/>
+      <w:r>
+        <w:rPr>
+          <w:rFonts w:cs="Calibri"/>
+          <w:b/>
+          <w:bCs/>
+          <w:sz w:val="32"/>
+          <w:szCs w:val="32"/>
+        </w:rPr>
+        <w:t>)</w:t>
       </w:r>
       <w:r>
         <w:rPr>
@@ -9868,6 +10675,7 @@
         <w:t xml:space="preserve"> converts it to String. Finally, </w:t>
       </w:r>
       <w:proofErr w:type="spellStart"/>
+      <w:proofErr w:type="gramStart"/>
       <w:r>
         <w:rPr>
           <w:rFonts w:cs="Calibri"/>
@@ -9887,7 +10695,18 @@
           <w:sz w:val="32"/>
           <w:szCs w:val="32"/>
         </w:rPr>
-        <w:t>()</w:t>
+        <w:t>(</w:t>
+      </w:r>
+      <w:proofErr w:type="gramEnd"/>
+      <w:r>
+        <w:rPr>
+          <w:rFonts w:cs="Calibri"/>
+          <w:b/>
+          <w:bCs/>
+          <w:sz w:val="32"/>
+          <w:szCs w:val="32"/>
+        </w:rPr>
+        <w:t>)</w:t>
       </w:r>
       <w:r>
         <w:rPr>
@@ -10000,7 +10819,16 @@
           <w:sz w:val="32"/>
           <w:szCs w:val="32"/>
         </w:rPr>
-        <w:t xml:space="preserve"># Use </w:t>
+        <w:t xml:space="preserve"># </w:t>
+      </w:r>
+      <w:proofErr w:type="gramStart"/>
+      <w:r>
+        <w:rPr>
+          <w:rFonts w:cs="Calibri"/>
+          <w:sz w:val="32"/>
+          <w:szCs w:val="32"/>
+        </w:rPr>
+        <w:t xml:space="preserve">Use </w:t>
       </w:r>
       <w:r>
         <w:rPr>
@@ -10024,6 +10852,7 @@
         <w:t>getString</w:t>
       </w:r>
       <w:proofErr w:type="spellEnd"/>
+      <w:proofErr w:type="gramEnd"/>
       <w:r>
         <w:rPr>
           <w:rFonts w:cs="Calibri"/>
@@ -10377,6 +11206,7 @@
         <w:t xml:space="preserve"> is the JSON string. </w:t>
       </w:r>
       <w:proofErr w:type="spellStart"/>
+      <w:proofErr w:type="gramStart"/>
       <w:r>
         <w:rPr>
           <w:rFonts w:cs="Calibri"/>
@@ -10396,6 +11226,65 @@
           <w:sz w:val="32"/>
           <w:szCs w:val="32"/>
         </w:rPr>
+        <w:t>(</w:t>
+      </w:r>
+      <w:proofErr w:type="gramEnd"/>
+      <w:r>
+        <w:rPr>
+          <w:rFonts w:cs="Calibri"/>
+          <w:b/>
+          <w:bCs/>
+          <w:sz w:val="32"/>
+          <w:szCs w:val="32"/>
+        </w:rPr>
+        <w:t xml:space="preserve">) </w:t>
+      </w:r>
+      <w:r>
+        <w:rPr>
+          <w:rFonts w:cs="Calibri"/>
+          <w:sz w:val="32"/>
+          <w:szCs w:val="32"/>
+        </w:rPr>
+        <w:t xml:space="preserve">converts it to a </w:t>
+      </w:r>
+      <w:r>
+        <w:rPr>
+          <w:rFonts w:cs="Calibri"/>
+          <w:b/>
+          <w:bCs/>
+          <w:sz w:val="32"/>
+          <w:szCs w:val="32"/>
+        </w:rPr>
+        <w:t>Map&lt;String, Dynamic&gt;</w:t>
+      </w:r>
+      <w:r>
+        <w:rPr>
+          <w:rFonts w:cs="Calibri"/>
+          <w:sz w:val="32"/>
+          <w:szCs w:val="32"/>
+        </w:rPr>
+        <w:t xml:space="preserve"> and </w:t>
+      </w:r>
+      <w:proofErr w:type="spellStart"/>
+      <w:r>
+        <w:rPr>
+          <w:rFonts w:cs="Calibri"/>
+          <w:b/>
+          <w:bCs/>
+          <w:sz w:val="32"/>
+          <w:szCs w:val="32"/>
+        </w:rPr>
+        <w:t>UserModel.fromJson</w:t>
+      </w:r>
+      <w:proofErr w:type="spellEnd"/>
+      <w:r>
+        <w:rPr>
+          <w:rFonts w:cs="Calibri"/>
+          <w:b/>
+          <w:bCs/>
+          <w:sz w:val="32"/>
+          <w:szCs w:val="32"/>
+        </w:rPr>
         <w:t xml:space="preserve">() </w:t>
       </w:r>
       <w:r>
@@ -10404,54 +11293,6 @@
           <w:sz w:val="32"/>
           <w:szCs w:val="32"/>
         </w:rPr>
-        <w:t xml:space="preserve">converts it to a </w:t>
-      </w:r>
-      <w:r>
-        <w:rPr>
-          <w:rFonts w:cs="Calibri"/>
-          <w:b/>
-          <w:bCs/>
-          <w:sz w:val="32"/>
-          <w:szCs w:val="32"/>
-        </w:rPr>
-        <w:t>Map&lt;String, Dynamic&gt;</w:t>
-      </w:r>
-      <w:r>
-        <w:rPr>
-          <w:rFonts w:cs="Calibri"/>
-          <w:sz w:val="32"/>
-          <w:szCs w:val="32"/>
-        </w:rPr>
-        <w:t xml:space="preserve"> and </w:t>
-      </w:r>
-      <w:proofErr w:type="spellStart"/>
-      <w:r>
-        <w:rPr>
-          <w:rFonts w:cs="Calibri"/>
-          <w:b/>
-          <w:bCs/>
-          <w:sz w:val="32"/>
-          <w:szCs w:val="32"/>
-        </w:rPr>
-        <w:t>UserModel.fromJson</w:t>
-      </w:r>
-      <w:proofErr w:type="spellEnd"/>
-      <w:r>
-        <w:rPr>
-          <w:rFonts w:cs="Calibri"/>
-          <w:b/>
-          <w:bCs/>
-          <w:sz w:val="32"/>
-          <w:szCs w:val="32"/>
-        </w:rPr>
-        <w:t xml:space="preserve">() </w:t>
-      </w:r>
-      <w:r>
-        <w:rPr>
-          <w:rFonts w:cs="Calibri"/>
-          <w:sz w:val="32"/>
-          <w:szCs w:val="32"/>
-        </w:rPr>
         <w:t>converts it to a Dart object. We only enter if toke is not null</w:t>
       </w:r>
     </w:p>
@@ -10636,6 +11477,7 @@
         <w:t xml:space="preserve"> =&gt; </w:t>
       </w:r>
       <w:proofErr w:type="spellStart"/>
+      <w:proofErr w:type="gramStart"/>
       <w:r>
         <w:rPr>
           <w:rFonts w:cs="Calibri"/>
@@ -10657,7 +11499,19 @@
           <w:sz w:val="32"/>
           <w:szCs w:val="32"/>
         </w:rPr>
-        <w:t xml:space="preserve"> != null;</w:t>
+        <w:t xml:space="preserve"> !</w:t>
+      </w:r>
+      <w:proofErr w:type="gramEnd"/>
+      <w:r>
+        <w:rPr>
+          <w:rFonts w:cs="Calibri"/>
+          <w:b/>
+          <w:bCs/>
+          <w:color w:val="D86DCB" w:themeColor="accent5" w:themeTint="99"/>
+          <w:sz w:val="32"/>
+          <w:szCs w:val="32"/>
+        </w:rPr>
+        <w:t>= null;</w:t>
       </w:r>
     </w:p>
     <w:p>
@@ -10927,6 +11781,7 @@
         <w:t xml:space="preserve">   static Future&lt;void&gt; </w:t>
       </w:r>
       <w:proofErr w:type="spellStart"/>
+      <w:proofErr w:type="gramStart"/>
       <w:r>
         <w:rPr>
           <w:rFonts w:cs="Calibri"/>
@@ -10951,6 +11806,7 @@
         <w:t>(</w:t>
       </w:r>
       <w:proofErr w:type="spellStart"/>
+      <w:proofErr w:type="gramEnd"/>
       <w:r>
         <w:rPr>
           <w:rFonts w:cs="Calibri"/>
@@ -11252,6 +12108,7 @@
         <w:t>(</w:t>
       </w:r>
       <w:proofErr w:type="spellStart"/>
+      <w:proofErr w:type="gramStart"/>
       <w:r>
         <w:rPr>
           <w:rFonts w:cs="Calibri"/>
@@ -11264,6 +12121,7 @@
         <w:t>model.toJson</w:t>
       </w:r>
       <w:proofErr w:type="spellEnd"/>
+      <w:proofErr w:type="gramEnd"/>
       <w:r>
         <w:rPr>
           <w:rFonts w:cs="Calibri"/>
@@ -11446,6 +12304,7 @@
         <w:t xml:space="preserve">  static Future&lt;void&gt; </w:t>
       </w:r>
       <w:proofErr w:type="spellStart"/>
+      <w:proofErr w:type="gramStart"/>
       <w:r>
         <w:rPr>
           <w:rFonts w:cs="Calibri"/>
@@ -11467,7 +12326,19 @@
           <w:sz w:val="32"/>
           <w:szCs w:val="32"/>
         </w:rPr>
-        <w:t>() async{</w:t>
+        <w:t>(</w:t>
+      </w:r>
+      <w:proofErr w:type="gramEnd"/>
+      <w:r>
+        <w:rPr>
+          <w:rFonts w:cs="Calibri"/>
+          <w:b/>
+          <w:bCs/>
+          <w:color w:val="D86DCB" w:themeColor="accent5" w:themeTint="99"/>
+          <w:sz w:val="32"/>
+          <w:szCs w:val="32"/>
+        </w:rPr>
+        <w:t>) async{</w:t>
       </w:r>
     </w:p>
     <w:p>
@@ -11672,7 +12543,31 @@
           <w:sz w:val="32"/>
           <w:szCs w:val="32"/>
         </w:rPr>
-        <w:t xml:space="preserve">     if(token != null) {</w:t>
+        <w:t xml:space="preserve">     </w:t>
+      </w:r>
+      <w:proofErr w:type="gramStart"/>
+      <w:r>
+        <w:rPr>
+          <w:rFonts w:cs="Calibri"/>
+          <w:b/>
+          <w:bCs/>
+          <w:color w:val="D86DCB" w:themeColor="accent5" w:themeTint="99"/>
+          <w:sz w:val="32"/>
+          <w:szCs w:val="32"/>
+        </w:rPr>
+        <w:t>if(</w:t>
+      </w:r>
+      <w:proofErr w:type="gramEnd"/>
+      <w:r>
+        <w:rPr>
+          <w:rFonts w:cs="Calibri"/>
+          <w:b/>
+          <w:bCs/>
+          <w:color w:val="D86DCB" w:themeColor="accent5" w:themeTint="99"/>
+          <w:sz w:val="32"/>
+          <w:szCs w:val="32"/>
+        </w:rPr>
+        <w:t>token != null) {</w:t>
       </w:r>
     </w:p>
     <w:p>
@@ -12132,6 +13027,7 @@
         <w:t xml:space="preserve">static Future&lt;bool&gt; </w:t>
       </w:r>
       <w:proofErr w:type="spellStart"/>
+      <w:proofErr w:type="gramStart"/>
       <w:r>
         <w:rPr>
           <w:rFonts w:cs="Calibri"/>
@@ -12153,7 +13049,19 @@
           <w:sz w:val="32"/>
           <w:szCs w:val="32"/>
         </w:rPr>
-        <w:t>() async {</w:t>
+        <w:t>(</w:t>
+      </w:r>
+      <w:proofErr w:type="gramEnd"/>
+      <w:r>
+        <w:rPr>
+          <w:rFonts w:cs="Calibri"/>
+          <w:b/>
+          <w:bCs/>
+          <w:color w:val="D86DCB" w:themeColor="accent5" w:themeTint="99"/>
+          <w:sz w:val="32"/>
+          <w:szCs w:val="32"/>
+        </w:rPr>
+        <w:t>) async {</w:t>
       </w:r>
     </w:p>
     <w:p>
@@ -12358,7 +13266,31 @@
           <w:sz w:val="32"/>
           <w:szCs w:val="32"/>
         </w:rPr>
-        <w:t xml:space="preserve">     if(token != null) </w:t>
+        <w:t xml:space="preserve">     </w:t>
+      </w:r>
+      <w:proofErr w:type="gramStart"/>
+      <w:r>
+        <w:rPr>
+          <w:rFonts w:cs="Calibri"/>
+          <w:b/>
+          <w:bCs/>
+          <w:color w:val="D86DCB" w:themeColor="accent5" w:themeTint="99"/>
+          <w:sz w:val="32"/>
+          <w:szCs w:val="32"/>
+        </w:rPr>
+        <w:t>if(</w:t>
+      </w:r>
+      <w:proofErr w:type="gramEnd"/>
+      <w:r>
+        <w:rPr>
+          <w:rFonts w:cs="Calibri"/>
+          <w:b/>
+          <w:bCs/>
+          <w:color w:val="D86DCB" w:themeColor="accent5" w:themeTint="99"/>
+          <w:sz w:val="32"/>
+          <w:szCs w:val="32"/>
+        </w:rPr>
+        <w:t xml:space="preserve">token != null) </w:t>
       </w:r>
       <w:proofErr w:type="spellStart"/>
       <w:r>
@@ -12406,7 +13338,31 @@
           <w:sz w:val="32"/>
           <w:szCs w:val="32"/>
         </w:rPr>
-        <w:t xml:space="preserve">     return token != null;</w:t>
+        <w:t xml:space="preserve">     return </w:t>
+      </w:r>
+      <w:proofErr w:type="gramStart"/>
+      <w:r>
+        <w:rPr>
+          <w:rFonts w:cs="Calibri"/>
+          <w:b/>
+          <w:bCs/>
+          <w:color w:val="D86DCB" w:themeColor="accent5" w:themeTint="99"/>
+          <w:sz w:val="32"/>
+          <w:szCs w:val="32"/>
+        </w:rPr>
+        <w:t>token !</w:t>
+      </w:r>
+      <w:proofErr w:type="gramEnd"/>
+      <w:r>
+        <w:rPr>
+          <w:rFonts w:cs="Calibri"/>
+          <w:b/>
+          <w:bCs/>
+          <w:color w:val="D86DCB" w:themeColor="accent5" w:themeTint="99"/>
+          <w:sz w:val="32"/>
+          <w:szCs w:val="32"/>
+        </w:rPr>
+        <w:t>= null;</w:t>
       </w:r>
     </w:p>
     <w:p>
@@ -12580,6 +13536,7 @@
         <w:t xml:space="preserve">static Future&lt;void&gt; </w:t>
       </w:r>
       <w:proofErr w:type="spellStart"/>
+      <w:proofErr w:type="gramStart"/>
       <w:r>
         <w:rPr>
           <w:rFonts w:cs="Calibri"/>
@@ -12604,6 +13561,7 @@
         <w:t>(</w:t>
       </w:r>
       <w:proofErr w:type="spellStart"/>
+      <w:proofErr w:type="gramEnd"/>
       <w:r>
         <w:rPr>
           <w:rFonts w:cs="Calibri"/>
@@ -12833,6 +13791,7 @@
         <w:t>(</w:t>
       </w:r>
       <w:proofErr w:type="spellStart"/>
+      <w:proofErr w:type="gramStart"/>
       <w:r>
         <w:rPr>
           <w:rFonts w:cs="Calibri"/>
@@ -12845,6 +13804,7 @@
         <w:t>model.toJson</w:t>
       </w:r>
       <w:proofErr w:type="spellEnd"/>
+      <w:proofErr w:type="gramEnd"/>
       <w:r>
         <w:rPr>
           <w:rFonts w:cs="Calibri"/>
@@ -12982,17 +13942,37 @@
           <w:sz w:val="32"/>
           <w:szCs w:val="32"/>
         </w:rPr>
-        <w:t xml:space="preserve"># Just use </w:t>
-      </w:r>
-      <w:r>
-        <w:rPr>
-          <w:rFonts w:cs="Calibri"/>
-          <w:b/>
-          <w:bCs/>
-          <w:sz w:val="32"/>
-          <w:szCs w:val="32"/>
-        </w:rPr>
-        <w:t>.remove()</w:t>
+        <w:t xml:space="preserve"># Just </w:t>
+      </w:r>
+      <w:proofErr w:type="gramStart"/>
+      <w:r>
+        <w:rPr>
+          <w:rFonts w:cs="Calibri"/>
+          <w:sz w:val="32"/>
+          <w:szCs w:val="32"/>
+        </w:rPr>
+        <w:t xml:space="preserve">use </w:t>
+      </w:r>
+      <w:r>
+        <w:rPr>
+          <w:rFonts w:cs="Calibri"/>
+          <w:b/>
+          <w:bCs/>
+          <w:sz w:val="32"/>
+          <w:szCs w:val="32"/>
+        </w:rPr>
+        <w:t>.remove</w:t>
+      </w:r>
+      <w:proofErr w:type="gramEnd"/>
+      <w:r>
+        <w:rPr>
+          <w:rFonts w:cs="Calibri"/>
+          <w:b/>
+          <w:bCs/>
+          <w:sz w:val="32"/>
+          <w:szCs w:val="32"/>
+        </w:rPr>
+        <w:t>()</w:t>
       </w:r>
       <w:r>
         <w:rPr>
@@ -13051,6 +14031,7 @@
         <w:t xml:space="preserve">static Future&lt;void&gt; </w:t>
       </w:r>
       <w:proofErr w:type="spellStart"/>
+      <w:proofErr w:type="gramStart"/>
       <w:r>
         <w:rPr>
           <w:rFonts w:cs="Calibri"/>
@@ -13072,7 +14053,19 @@
           <w:sz w:val="32"/>
           <w:szCs w:val="32"/>
         </w:rPr>
-        <w:t>() async {</w:t>
+        <w:t>(</w:t>
+      </w:r>
+      <w:proofErr w:type="gramEnd"/>
+      <w:r>
+        <w:rPr>
+          <w:rFonts w:cs="Calibri"/>
+          <w:b/>
+          <w:bCs/>
+          <w:color w:val="D86DCB" w:themeColor="accent5" w:themeTint="99"/>
+          <w:sz w:val="32"/>
+          <w:szCs w:val="32"/>
+        </w:rPr>
+        <w:t>) async {</w:t>
       </w:r>
     </w:p>
     <w:p>
@@ -13171,6 +14164,7 @@
         <w:t xml:space="preserve">  await </w:t>
       </w:r>
       <w:proofErr w:type="spellStart"/>
+      <w:proofErr w:type="gramStart"/>
       <w:r>
         <w:rPr>
           <w:rFonts w:cs="Calibri"/>
@@ -13183,6 +14177,7 @@
         <w:t>prefs.remove</w:t>
       </w:r>
       <w:proofErr w:type="spellEnd"/>
+      <w:proofErr w:type="gramEnd"/>
       <w:r>
         <w:rPr>
           <w:rFonts w:cs="Calibri"/>
@@ -13243,6 +14238,7 @@
         <w:t xml:space="preserve">  await </w:t>
       </w:r>
       <w:proofErr w:type="spellStart"/>
+      <w:proofErr w:type="gramStart"/>
       <w:r>
         <w:rPr>
           <w:rFonts w:cs="Calibri"/>
@@ -13255,6 +14251,7 @@
         <w:t>prefs.remove</w:t>
       </w:r>
       <w:proofErr w:type="spellEnd"/>
+      <w:proofErr w:type="gramEnd"/>
       <w:r>
         <w:rPr>
           <w:rFonts w:cs="Calibri"/>
@@ -13429,15 +14426,27 @@
         <w:lastRenderedPageBreak/>
         <w:t xml:space="preserve"># To clear everything. </w:t>
       </w:r>
-      <w:r>
-        <w:rPr>
-          <w:rFonts w:cs="Calibri"/>
-          <w:b/>
-          <w:bCs/>
-          <w:sz w:val="32"/>
-          <w:szCs w:val="32"/>
-        </w:rPr>
-        <w:t>clear()</w:t>
+      <w:proofErr w:type="gramStart"/>
+      <w:r>
+        <w:rPr>
+          <w:rFonts w:cs="Calibri"/>
+          <w:b/>
+          <w:bCs/>
+          <w:sz w:val="32"/>
+          <w:szCs w:val="32"/>
+        </w:rPr>
+        <w:t>clear(</w:t>
+      </w:r>
+      <w:proofErr w:type="gramEnd"/>
+      <w:r>
+        <w:rPr>
+          <w:rFonts w:cs="Calibri"/>
+          <w:b/>
+          <w:bCs/>
+          <w:sz w:val="32"/>
+          <w:szCs w:val="32"/>
+        </w:rPr>
+        <w:t>)</w:t>
       </w:r>
       <w:r>
         <w:rPr>
@@ -13472,6 +14481,7 @@
         <w:t xml:space="preserve">await </w:t>
       </w:r>
       <w:proofErr w:type="spellStart"/>
+      <w:proofErr w:type="gramStart"/>
       <w:r>
         <w:rPr>
           <w:rFonts w:cs="Calibri"/>
@@ -13484,6 +14494,7 @@
         <w:t>prefs.clear</w:t>
       </w:r>
       <w:proofErr w:type="spellEnd"/>
+      <w:proofErr w:type="gramEnd"/>
       <w:r>
         <w:rPr>
           <w:rFonts w:cs="Calibri"/>
@@ -13719,6 +14730,7 @@
         </w:rPr>
         <w:t xml:space="preserve">Forgetting </w:t>
       </w:r>
+      <w:proofErr w:type="gramStart"/>
       <w:r>
         <w:rPr>
           <w:rFonts w:cs="Calibri"/>
@@ -13729,6 +14741,7 @@
         </w:rPr>
         <w:t>await</w:t>
       </w:r>
+      <w:proofErr w:type="gramEnd"/>
     </w:p>
     <w:p>
       <w:pPr>
@@ -15203,7 +16216,25 @@
                 <w:sz w:val="28"/>
                 <w:szCs w:val="28"/>
               </w:rPr>
-              <w:t>Hight performance apps, Large datasets, Real-time sync apps, Offline-first apps</w:t>
+              <w:t xml:space="preserve">Hight performance apps, </w:t>
+            </w:r>
+            <w:proofErr w:type="gramStart"/>
+            <w:r>
+              <w:rPr>
+                <w:rFonts w:cs="Calibri"/>
+                <w:sz w:val="28"/>
+                <w:szCs w:val="28"/>
+              </w:rPr>
+              <w:t>Large</w:t>
+            </w:r>
+            <w:proofErr w:type="gramEnd"/>
+            <w:r>
+              <w:rPr>
+                <w:rFonts w:cs="Calibri"/>
+                <w:sz w:val="28"/>
+                <w:szCs w:val="28"/>
+              </w:rPr>
+              <w:t xml:space="preserve"> datasets, Real-time sync apps, Offline-first apps</w:t>
             </w:r>
           </w:p>
         </w:tc>

</xml_diff>